<commit_message>
Rename split datasets on disk and update all script and report references
</commit_message>
<xml_diff>
--- a/internship_report.docx
+++ b/internship_report.docx
@@ -927,7 +927,7 @@
         <w:br/>
         <w:t>pip install pandas numpy scikit-learn xgboost lightgbm torch matplotlib psutil scapy</w:t>
         <w:br/>
-        <w:t>The raw logs (conn.log.train_80_20, conn.log.test_80_20, conn.log.calibration_90_10) must be placed in the project root directory.</w:t>
+        <w:t>The raw logs (conn.log.train_20_80, conn.log.test_90_10, conn.log.calibration_90_10) must be placed in the project root directory.</w:t>
       </w:r>
     </w:p>
     <w:p>
@@ -951,7 +951,7 @@
         <w:t xml:space="preserve">* Step 1: Profiling and Chronological Splitting: </w:t>
       </w:r>
       <w:r>
-        <w:t>Profile class counts and establish temporal boundaries. Read raw splits, map string labels into benign boolean flags, and sample validation and test partitions into a standard 90:10 benign-to-malicious imbalance ratio. Saves: conn.log.train_80_20, conn.log.test_80_20, conn.log.calibration_90_10.</w:t>
+        <w:t>Profile class counts and establish temporal boundaries. Read raw splits, map string labels into benign boolean flags, and sample validation and test partitions into a standard 90:10 benign-to-malicious imbalance ratio. Saves: conn.log.train_20_80, conn.log.test_90_10, conn.log.calibration_90_10.</w:t>
       </w:r>
     </w:p>
     <w:p>

</xml_diff>

<commit_message>
Finalize black-and-white internship report with embedded figures and baseline LSTM title
</commit_message>
<xml_diff>
--- a/internship_report.docx
+++ b/internship_report.docx
@@ -13,10 +13,10 @@
       <w:r>
         <w:rPr>
           <w:b/>
-          <w:color w:val="1F4E79"/>
-          <w:sz w:val="48"/>
+          <w:color w:val="000000"/>
+          <w:sz w:val="64"/>
         </w:rPr>
-        <w:t>Real-Time IoT Botnet Detection using Quantized LSTM Models on Chronological Zeek Logs</w:t>
+        <w:t>Real-Time IoT Botnet Detection using Baseline LSTM on Chronological Zeek Logs</w:t>
       </w:r>
     </w:p>
     <w:p/>
@@ -27,13 +27,12 @@
       <w:r>
         <w:rPr>
           <w:i/>
-          <w:color w:val="595959"/>
+          <w:color w:val="000000"/>
           <w:sz w:val="26"/>
         </w:rPr>
         <w:t>An Internship Project Report</w:t>
       </w:r>
     </w:p>
-    <w:p/>
     <w:p/>
     <w:p/>
     <w:p/>
@@ -70,7 +69,7 @@
       <w:r>
         <w:rPr>
           <w:b/>
-          <w:color w:val="1F4E79"/>
+          <w:color w:val="000000"/>
           <w:sz w:val="24"/>
         </w:rPr>
         <w:t>Department of Computer Science and Engineering</w:t>
@@ -102,14 +101,14 @@
       <w:r>
         <w:rPr>
           <w:rFonts w:ascii="Calibri" w:hAnsi="Calibri"/>
-          <w:color w:val="1F4E79"/>
+          <w:color w:val="000000"/>
         </w:rPr>
         <w:t>Bonafide Certificate</w:t>
       </w:r>
     </w:p>
     <w:p>
       <w:r>
-        <w:t>This is to certify that the project report entitled "Real-Time IoT Botnet Detection using Quantized LSTM Models on Chronological Zeek Logs" is a bonafide record of the internship work carried out by Sushanth (Roll No: ____________) in the Department of Computer Science and Engineering, Indian Institute of Information Technology Design and Manufacturing (IIITDM), Kancheepuram, under our supervision.</w:t>
+        <w:t>This is to certify that the project report entitled "Real-Time IoT Botnet Detection using Baseline LSTM on Chronological Zeek Logs" is a bonafide record of the internship work carried out by Sushanth (Roll No: ____________) in the Department of Computer Science and Engineering, Indian Institute of Information Technology Design and Manufacturing (IIITDM), Kancheepuram, under our supervision.</w:t>
       </w:r>
     </w:p>
     <w:p/>
@@ -160,7 +159,7 @@
       <w:r>
         <w:rPr>
           <w:rFonts w:ascii="Calibri" w:hAnsi="Calibri"/>
-          <w:color w:val="1F4E79"/>
+          <w:color w:val="000000"/>
         </w:rPr>
         <w:t>Acknowledgement</w:t>
       </w:r>
@@ -193,7 +192,7 @@
       <w:r>
         <w:rPr>
           <w:rFonts w:ascii="Calibri" w:hAnsi="Calibri"/>
-          <w:color w:val="1F4E79"/>
+          <w:color w:val="000000"/>
         </w:rPr>
         <w:t>Abstract</w:t>
       </w:r>
@@ -203,7 +202,7 @@
         <w:t>Internet of Things (IoT) deployments are highly vulnerable to distributed botnet propagation (e.g., Mirai, Hajime) due to hardware constraints and default security configurations. Traditional signature-based detection systems fail to catch zero-day exploits, while standard machine learning classifiers suffer from performance degradation under temporal concept drift and high false-alarm rates due to extreme class imbalances.</w:t>
         <w:br/>
         <w:br/>
-        <w:t>This project implements an end-to-end, temporal-aware, real-time intrusion detection pipeline using quantized Long Short-Term Memory (LSTM) networks trained on Zeek/Conn log captures from the IoT-23 dataset. The baseline LSTM model achieves a high recall rate (89.43%) on internal test datasets, outperforming tree-based models (XGBoost, LightGBM) on out-of-distribution (OOD) validation test streams.</w:t>
+        <w:t>This project implements an end-to-end, temporal-aware, real-time intrusion detection pipeline using a baseline Long Short-Term Memory (LSTM) network trained on Zeek/Conn log captures from the IoT-23 dataset. The baseline LSTM model achieves a high recall rate (89.43%) on internal test datasets, outperforming tree-based models (XGBoost, LightGBM) on out-of-distribution (OOD) validation test streams.</w:t>
         <w:br/>
         <w:br/>
         <w:t>To bridge the gap between model training and deployment constraints, the LSTM is compressed via INT8 dynamic weight quantization, reducing model footprint by 68% while preserving sequential inference latencies on CPU targets. Finally, a real-time Scapy sniffing adapter with integrated benign IP whitelisting is deployed to demonstrate sporadic scanning threats and prevent sequence bleeding false positives.</w:t>
@@ -222,117 +221,596 @@
       <w:r>
         <w:rPr>
           <w:rFonts w:ascii="Calibri" w:hAnsi="Calibri"/>
-          <w:color w:val="1F4E79"/>
+          <w:color w:val="000000"/>
         </w:rPr>
         <w:t>Table of Contents</w:t>
       </w:r>
     </w:p>
-    <w:p>
-      <w:r>
-        <w:t>Bonafide Certificate ....................................................... i</w:t>
-        <w:br/>
-      </w:r>
-      <w:r>
-        <w:t>Acknowledgement ............................................................ ii</w:t>
-        <w:br/>
-      </w:r>
-      <w:r>
-        <w:t>Abstract ................................................................... iii</w:t>
-        <w:br/>
-      </w:r>
-      <w:r>
-        <w:t>Table of Contents .......................................................... iv</w:t>
-        <w:br/>
-      </w:r>
-      <w:r>
-        <w:t>List of Figures ............................................................ v</w:t>
-        <w:br/>
-      </w:r>
-      <w:r>
-        <w:t>List of Abbreviations ...................................................... vi</w:t>
-        <w:br/>
-      </w:r>
-      <w:r>
-        <w:t>Company &amp; Internship Details ............................................... vii</w:t>
-        <w:br/>
-      </w:r>
-      <w:r>
-        <w:t>GEO-Tagged Photo Evidence .................................................. viii</w:t>
-        <w:br/>
-      </w:r>
-      <w:r>
-        <w:t>1 — Introduction ........................................................... 1</w:t>
-        <w:br/>
-      </w:r>
-      <w:r>
-        <w:t xml:space="preserve">    1.1 Acceptance Criteria ................................................ 1</w:t>
-        <w:br/>
-      </w:r>
-      <w:r>
-        <w:t xml:space="preserve">    1.2 Technologies Used .................................................. 2</w:t>
-        <w:br/>
-      </w:r>
-      <w:r>
-        <w:t xml:space="preserve">    1.3 Domains Covered .................................................... 2</w:t>
-        <w:br/>
-      </w:r>
-      <w:r>
-        <w:t>2 — Project Architecture, Design &amp; Implementation .......................... 3</w:t>
-        <w:br/>
-      </w:r>
-      <w:r>
-        <w:t xml:space="preserve">    2.1 Features Implemented ............................................... 3</w:t>
-        <w:br/>
-      </w:r>
-      <w:r>
-        <w:t xml:space="preserve">    2.2 Pre-Requisites ..................................................... 4</w:t>
-        <w:br/>
-      </w:r>
-      <w:r>
-        <w:t xml:space="preserve">    2.3 Implementation Steps ............................................... 5</w:t>
-        <w:br/>
-      </w:r>
-      <w:r>
-        <w:t>3 — Results and Analysis ................................................... 9</w:t>
-        <w:br/>
-      </w:r>
-      <w:r>
-        <w:t>4 — Learning Outcomes ...................................................... 12</w:t>
-        <w:br/>
-      </w:r>
-      <w:r>
-        <w:t xml:space="preserve">    4.1 Project Learning Outcomes .......................................... 12</w:t>
-        <w:br/>
-      </w:r>
-      <w:r>
-        <w:t xml:space="preserve">    4.2 Internship Learning Outcomes ....................................... 14</w:t>
-        <w:br/>
-      </w:r>
-      <w:r>
-        <w:t xml:space="preserve">    4.3 Skills Acquired .................................................... 15</w:t>
-        <w:br/>
-      </w:r>
-      <w:r>
-        <w:t xml:space="preserve">    4.4 Best Learning from this Internship ................................. 15</w:t>
-        <w:br/>
-      </w:r>
-      <w:r>
-        <w:t>5 — Conclusion ............................................................. 16</w:t>
-        <w:br/>
-      </w:r>
-      <w:r>
-        <w:t xml:space="preserve">    5.2 Feedback ........................................................... 17</w:t>
-        <w:br/>
-      </w:r>
-      <w:r>
-        <w:t xml:space="preserve">    5.3 Declaration &amp; Signature ............................................ 17</w:t>
-        <w:br/>
-      </w:r>
-      <w:r>
-        <w:t>References ................................................................. 18</w:t>
-        <w:br/>
-      </w:r>
-    </w:p>
+    <w:tbl>
+      <w:tblPr>
+        <w:tblStyle w:val="TableGrid"/>
+        <w:tblW w:type="auto" w:w="0"/>
+        <w:jc w:val="center"/>
+        <w:tblLook w:firstColumn="1" w:firstRow="1" w:lastColumn="0" w:lastRow="0" w:noHBand="0" w:noVBand="1" w:val="04A0"/>
+      </w:tblPr>
+      <w:tblGrid>
+        <w:gridCol w:w="4680"/>
+        <w:gridCol w:w="4680"/>
+      </w:tblGrid>
+      <w:tr>
+        <w:tc>
+          <w:tcPr>
+            <w:tcW w:type="dxa" w:w="7488"/>
+          </w:tcPr>
+          <w:p>
+            <w:r>
+              <w:t>Bonafide Certificate</w:t>
+            </w:r>
+          </w:p>
+        </w:tc>
+        <w:tc>
+          <w:tcPr>
+            <w:tcW w:type="dxa" w:w="1440"/>
+          </w:tcPr>
+          <w:p>
+            <w:r>
+              <w:t>i</w:t>
+            </w:r>
+          </w:p>
+        </w:tc>
+      </w:tr>
+      <w:tr>
+        <w:tc>
+          <w:tcPr>
+            <w:tcW w:type="dxa" w:w="7488"/>
+          </w:tcPr>
+          <w:p>
+            <w:r>
+              <w:t>Acknowledgement</w:t>
+            </w:r>
+          </w:p>
+        </w:tc>
+        <w:tc>
+          <w:tcPr>
+            <w:tcW w:type="dxa" w:w="1440"/>
+          </w:tcPr>
+          <w:p>
+            <w:r>
+              <w:t>ii</w:t>
+            </w:r>
+          </w:p>
+        </w:tc>
+      </w:tr>
+      <w:tr>
+        <w:tc>
+          <w:tcPr>
+            <w:tcW w:type="dxa" w:w="7488"/>
+          </w:tcPr>
+          <w:p>
+            <w:r>
+              <w:t>Abstract</w:t>
+            </w:r>
+          </w:p>
+        </w:tc>
+        <w:tc>
+          <w:tcPr>
+            <w:tcW w:type="dxa" w:w="1440"/>
+          </w:tcPr>
+          <w:p>
+            <w:r>
+              <w:t>iii</w:t>
+            </w:r>
+          </w:p>
+        </w:tc>
+      </w:tr>
+      <w:tr>
+        <w:tc>
+          <w:tcPr>
+            <w:tcW w:type="dxa" w:w="7488"/>
+          </w:tcPr>
+          <w:p>
+            <w:r>
+              <w:t>Table of Contents</w:t>
+            </w:r>
+          </w:p>
+        </w:tc>
+        <w:tc>
+          <w:tcPr>
+            <w:tcW w:type="dxa" w:w="1440"/>
+          </w:tcPr>
+          <w:p>
+            <w:r>
+              <w:t>iv</w:t>
+            </w:r>
+          </w:p>
+        </w:tc>
+      </w:tr>
+      <w:tr>
+        <w:tc>
+          <w:tcPr>
+            <w:tcW w:type="dxa" w:w="7488"/>
+          </w:tcPr>
+          <w:p>
+            <w:r>
+              <w:t>List of Figures</w:t>
+            </w:r>
+          </w:p>
+        </w:tc>
+        <w:tc>
+          <w:tcPr>
+            <w:tcW w:type="dxa" w:w="1440"/>
+          </w:tcPr>
+          <w:p>
+            <w:r>
+              <w:t>v</w:t>
+            </w:r>
+          </w:p>
+        </w:tc>
+      </w:tr>
+      <w:tr>
+        <w:tc>
+          <w:tcPr>
+            <w:tcW w:type="dxa" w:w="7488"/>
+          </w:tcPr>
+          <w:p>
+            <w:r>
+              <w:t>List of Abbreviations</w:t>
+            </w:r>
+          </w:p>
+        </w:tc>
+        <w:tc>
+          <w:tcPr>
+            <w:tcW w:type="dxa" w:w="1440"/>
+          </w:tcPr>
+          <w:p>
+            <w:r>
+              <w:t>vi</w:t>
+            </w:r>
+          </w:p>
+        </w:tc>
+      </w:tr>
+      <w:tr>
+        <w:tc>
+          <w:tcPr>
+            <w:tcW w:type="dxa" w:w="7488"/>
+          </w:tcPr>
+          <w:p>
+            <w:r>
+              <w:t>Company &amp; Internship Details</w:t>
+            </w:r>
+          </w:p>
+        </w:tc>
+        <w:tc>
+          <w:tcPr>
+            <w:tcW w:type="dxa" w:w="1440"/>
+          </w:tcPr>
+          <w:p>
+            <w:r>
+              <w:t>vii</w:t>
+            </w:r>
+          </w:p>
+        </w:tc>
+      </w:tr>
+      <w:tr>
+        <w:tc>
+          <w:tcPr>
+            <w:tcW w:type="dxa" w:w="7488"/>
+          </w:tcPr>
+          <w:p>
+            <w:r>
+              <w:t>GEO-Tagged Photo Evidence</w:t>
+            </w:r>
+          </w:p>
+        </w:tc>
+        <w:tc>
+          <w:tcPr>
+            <w:tcW w:type="dxa" w:w="1440"/>
+          </w:tcPr>
+          <w:p>
+            <w:r>
+              <w:t>viii</w:t>
+            </w:r>
+          </w:p>
+        </w:tc>
+      </w:tr>
+      <w:tr>
+        <w:tc>
+          <w:tcPr>
+            <w:tcW w:type="dxa" w:w="7488"/>
+          </w:tcPr>
+          <w:p>
+            <w:r>
+              <w:t>1 — Introduction</w:t>
+            </w:r>
+          </w:p>
+        </w:tc>
+        <w:tc>
+          <w:tcPr>
+            <w:tcW w:type="dxa" w:w="1440"/>
+          </w:tcPr>
+          <w:p>
+            <w:r>
+              <w:t>1</w:t>
+            </w:r>
+          </w:p>
+        </w:tc>
+      </w:tr>
+      <w:tr>
+        <w:tc>
+          <w:tcPr>
+            <w:tcW w:type="dxa" w:w="7488"/>
+          </w:tcPr>
+          <w:p>
+            <w:r>
+              <w:t xml:space="preserve">    1.1 Acceptance Criteria</w:t>
+            </w:r>
+          </w:p>
+        </w:tc>
+        <w:tc>
+          <w:tcPr>
+            <w:tcW w:type="dxa" w:w="1440"/>
+          </w:tcPr>
+          <w:p>
+            <w:r>
+              <w:t>1</w:t>
+            </w:r>
+          </w:p>
+        </w:tc>
+      </w:tr>
+      <w:tr>
+        <w:tc>
+          <w:tcPr>
+            <w:tcW w:type="dxa" w:w="7488"/>
+          </w:tcPr>
+          <w:p>
+            <w:r>
+              <w:t xml:space="preserve">    1.2 Technologies Used</w:t>
+            </w:r>
+          </w:p>
+        </w:tc>
+        <w:tc>
+          <w:tcPr>
+            <w:tcW w:type="dxa" w:w="1440"/>
+          </w:tcPr>
+          <w:p>
+            <w:r>
+              <w:t>2</w:t>
+            </w:r>
+          </w:p>
+        </w:tc>
+      </w:tr>
+      <w:tr>
+        <w:tc>
+          <w:tcPr>
+            <w:tcW w:type="dxa" w:w="7488"/>
+          </w:tcPr>
+          <w:p>
+            <w:r>
+              <w:t xml:space="preserve">    1.3 Domains Covered</w:t>
+            </w:r>
+          </w:p>
+        </w:tc>
+        <w:tc>
+          <w:tcPr>
+            <w:tcW w:type="dxa" w:w="1440"/>
+          </w:tcPr>
+          <w:p>
+            <w:r>
+              <w:t>2</w:t>
+            </w:r>
+          </w:p>
+        </w:tc>
+      </w:tr>
+      <w:tr>
+        <w:tc>
+          <w:tcPr>
+            <w:tcW w:type="dxa" w:w="7488"/>
+          </w:tcPr>
+          <w:p>
+            <w:r>
+              <w:t>2 — Project Architecture, Design &amp; Implementation</w:t>
+            </w:r>
+          </w:p>
+        </w:tc>
+        <w:tc>
+          <w:tcPr>
+            <w:tcW w:type="dxa" w:w="1440"/>
+          </w:tcPr>
+          <w:p>
+            <w:r>
+              <w:t>3</w:t>
+            </w:r>
+          </w:p>
+        </w:tc>
+      </w:tr>
+      <w:tr>
+        <w:tc>
+          <w:tcPr>
+            <w:tcW w:type="dxa" w:w="7488"/>
+          </w:tcPr>
+          <w:p>
+            <w:r>
+              <w:t xml:space="preserve">    2.1 Features Implemented</w:t>
+            </w:r>
+          </w:p>
+        </w:tc>
+        <w:tc>
+          <w:tcPr>
+            <w:tcW w:type="dxa" w:w="1440"/>
+          </w:tcPr>
+          <w:p>
+            <w:r>
+              <w:t>3</w:t>
+            </w:r>
+          </w:p>
+        </w:tc>
+      </w:tr>
+      <w:tr>
+        <w:tc>
+          <w:tcPr>
+            <w:tcW w:type="dxa" w:w="7488"/>
+          </w:tcPr>
+          <w:p>
+            <w:r>
+              <w:t xml:space="preserve">    2.2 Pre-Requisites</w:t>
+            </w:r>
+          </w:p>
+        </w:tc>
+        <w:tc>
+          <w:tcPr>
+            <w:tcW w:type="dxa" w:w="1440"/>
+          </w:tcPr>
+          <w:p>
+            <w:r>
+              <w:t>4</w:t>
+            </w:r>
+          </w:p>
+        </w:tc>
+      </w:tr>
+      <w:tr>
+        <w:tc>
+          <w:tcPr>
+            <w:tcW w:type="dxa" w:w="7488"/>
+          </w:tcPr>
+          <w:p>
+            <w:r>
+              <w:t xml:space="preserve">    2.3 Implementation Steps</w:t>
+            </w:r>
+          </w:p>
+        </w:tc>
+        <w:tc>
+          <w:tcPr>
+            <w:tcW w:type="dxa" w:w="1440"/>
+          </w:tcPr>
+          <w:p>
+            <w:r>
+              <w:t>5</w:t>
+            </w:r>
+          </w:p>
+        </w:tc>
+      </w:tr>
+      <w:tr>
+        <w:tc>
+          <w:tcPr>
+            <w:tcW w:type="dxa" w:w="7488"/>
+          </w:tcPr>
+          <w:p>
+            <w:r>
+              <w:t>3 — Results and Analysis</w:t>
+            </w:r>
+          </w:p>
+        </w:tc>
+        <w:tc>
+          <w:tcPr>
+            <w:tcW w:type="dxa" w:w="1440"/>
+          </w:tcPr>
+          <w:p>
+            <w:r>
+              <w:t>9</w:t>
+            </w:r>
+          </w:p>
+        </w:tc>
+      </w:tr>
+      <w:tr>
+        <w:tc>
+          <w:tcPr>
+            <w:tcW w:type="dxa" w:w="7488"/>
+          </w:tcPr>
+          <w:p>
+            <w:r>
+              <w:t>4 — Learning Outcomes</w:t>
+            </w:r>
+          </w:p>
+        </w:tc>
+        <w:tc>
+          <w:tcPr>
+            <w:tcW w:type="dxa" w:w="1440"/>
+          </w:tcPr>
+          <w:p>
+            <w:r>
+              <w:t>12</w:t>
+            </w:r>
+          </w:p>
+        </w:tc>
+      </w:tr>
+      <w:tr>
+        <w:tc>
+          <w:tcPr>
+            <w:tcW w:type="dxa" w:w="7488"/>
+          </w:tcPr>
+          <w:p>
+            <w:r>
+              <w:t xml:space="preserve">    4.1 Project Learning Outcomes</w:t>
+            </w:r>
+          </w:p>
+        </w:tc>
+        <w:tc>
+          <w:tcPr>
+            <w:tcW w:type="dxa" w:w="1440"/>
+          </w:tcPr>
+          <w:p>
+            <w:r>
+              <w:t>12</w:t>
+            </w:r>
+          </w:p>
+        </w:tc>
+      </w:tr>
+      <w:tr>
+        <w:tc>
+          <w:tcPr>
+            <w:tcW w:type="dxa" w:w="7488"/>
+          </w:tcPr>
+          <w:p>
+            <w:r>
+              <w:t xml:space="preserve">    4.2 Internship Learning Outcomes</w:t>
+            </w:r>
+          </w:p>
+        </w:tc>
+        <w:tc>
+          <w:tcPr>
+            <w:tcW w:type="dxa" w:w="1440"/>
+          </w:tcPr>
+          <w:p>
+            <w:r>
+              <w:t>14</w:t>
+            </w:r>
+          </w:p>
+        </w:tc>
+      </w:tr>
+      <w:tr>
+        <w:tc>
+          <w:tcPr>
+            <w:tcW w:type="dxa" w:w="7488"/>
+          </w:tcPr>
+          <w:p>
+            <w:r>
+              <w:t xml:space="preserve">    4.3 Skills Acquired</w:t>
+            </w:r>
+          </w:p>
+        </w:tc>
+        <w:tc>
+          <w:tcPr>
+            <w:tcW w:type="dxa" w:w="1440"/>
+          </w:tcPr>
+          <w:p>
+            <w:r>
+              <w:t>15</w:t>
+            </w:r>
+          </w:p>
+        </w:tc>
+      </w:tr>
+      <w:tr>
+        <w:tc>
+          <w:tcPr>
+            <w:tcW w:type="dxa" w:w="7488"/>
+          </w:tcPr>
+          <w:p>
+            <w:r>
+              <w:t xml:space="preserve">    4.4 Best Learning from this Internship</w:t>
+            </w:r>
+          </w:p>
+        </w:tc>
+        <w:tc>
+          <w:tcPr>
+            <w:tcW w:type="dxa" w:w="1440"/>
+          </w:tcPr>
+          <w:p>
+            <w:r>
+              <w:t>15</w:t>
+            </w:r>
+          </w:p>
+        </w:tc>
+      </w:tr>
+      <w:tr>
+        <w:tc>
+          <w:tcPr>
+            <w:tcW w:type="dxa" w:w="7488"/>
+          </w:tcPr>
+          <w:p>
+            <w:r>
+              <w:t>5 — Conclusion</w:t>
+            </w:r>
+          </w:p>
+        </w:tc>
+        <w:tc>
+          <w:tcPr>
+            <w:tcW w:type="dxa" w:w="1440"/>
+          </w:tcPr>
+          <w:p>
+            <w:r>
+              <w:t>16</w:t>
+            </w:r>
+          </w:p>
+        </w:tc>
+      </w:tr>
+      <w:tr>
+        <w:tc>
+          <w:tcPr>
+            <w:tcW w:type="dxa" w:w="7488"/>
+          </w:tcPr>
+          <w:p>
+            <w:r>
+              <w:t xml:space="preserve">    5.2 Feedback</w:t>
+            </w:r>
+          </w:p>
+        </w:tc>
+        <w:tc>
+          <w:tcPr>
+            <w:tcW w:type="dxa" w:w="1440"/>
+          </w:tcPr>
+          <w:p>
+            <w:r>
+              <w:t>17</w:t>
+            </w:r>
+          </w:p>
+        </w:tc>
+      </w:tr>
+      <w:tr>
+        <w:tc>
+          <w:tcPr>
+            <w:tcW w:type="dxa" w:w="7488"/>
+          </w:tcPr>
+          <w:p>
+            <w:r>
+              <w:t xml:space="preserve">    5.3 Declaration &amp; Signature</w:t>
+            </w:r>
+          </w:p>
+        </w:tc>
+        <w:tc>
+          <w:tcPr>
+            <w:tcW w:type="dxa" w:w="1440"/>
+          </w:tcPr>
+          <w:p>
+            <w:r>
+              <w:t>17</w:t>
+            </w:r>
+          </w:p>
+        </w:tc>
+      </w:tr>
+      <w:tr>
+        <w:tc>
+          <w:tcPr>
+            <w:tcW w:type="dxa" w:w="7488"/>
+          </w:tcPr>
+          <w:p>
+            <w:r>
+              <w:t>References</w:t>
+            </w:r>
+          </w:p>
+        </w:tc>
+        <w:tc>
+          <w:tcPr>
+            <w:tcW w:type="dxa" w:w="1440"/>
+          </w:tcPr>
+          <w:p>
+            <w:r>
+              <w:t>18</w:t>
+            </w:r>
+          </w:p>
+        </w:tc>
+      </w:tr>
+    </w:tbl>
+    <w:p/>
     <w:p>
       <w:r>
         <w:br w:type="page"/>
@@ -346,37 +824,156 @@
       <w:r>
         <w:rPr>
           <w:rFonts w:ascii="Calibri" w:hAnsi="Calibri"/>
-          <w:color w:val="1F4E79"/>
+          <w:color w:val="000000"/>
         </w:rPr>
         <w:t>List of Figures</w:t>
       </w:r>
     </w:p>
-    <w:p>
-      <w:r>
-        <w:t>Figure 1.1: End-to-End Modular Machine Learning Pipeline Architecture Diagram ... 3</w:t>
-        <w:br/>
-      </w:r>
-      <w:r>
-        <w:t>Figure 2.1: Chronological vs. Shuffled Splitting Data Leakage Concept ........... 6</w:t>
-        <w:br/>
-      </w:r>
-      <w:r>
-        <w:t>Figure 3.1: Model Validation Confusion Matrix for Dataset A (Temporal Test) ..... 9</w:t>
-        <w:br/>
-      </w:r>
-      <w:r>
-        <w:t>Figure 3.2: Model Validation Confusion Matrix for Dataset B (OOD Calibration) ... 10</w:t>
-        <w:br/>
-      </w:r>
-      <w:r>
-        <w:t>Figure 3.3: Optimization Comparison: File Size and Latency trade-offs ........... 11</w:t>
-        <w:br/>
-      </w:r>
-      <w:r>
-        <w:t>Figure 3.4: Feature Ablation Performance Bar Chart .............................. 12</w:t>
-        <w:br/>
-      </w:r>
-    </w:p>
+    <w:tbl>
+      <w:tblPr>
+        <w:tblStyle w:val="TableGrid"/>
+        <w:tblW w:type="auto" w:w="0"/>
+        <w:jc w:val="center"/>
+        <w:tblLook w:firstColumn="1" w:firstRow="1" w:lastColumn="0" w:lastRow="0" w:noHBand="0" w:noVBand="1" w:val="04A0"/>
+      </w:tblPr>
+      <w:tblGrid>
+        <w:gridCol w:w="4680"/>
+        <w:gridCol w:w="4680"/>
+      </w:tblGrid>
+      <w:tr>
+        <w:tc>
+          <w:tcPr>
+            <w:tcW w:type="dxa" w:w="7488"/>
+          </w:tcPr>
+          <w:p>
+            <w:r>
+              <w:t>Figure 1.1: End-to-End Modular Machine Learning Pipeline Architecture Diagram</w:t>
+            </w:r>
+          </w:p>
+        </w:tc>
+        <w:tc>
+          <w:tcPr>
+            <w:tcW w:type="dxa" w:w="1440"/>
+          </w:tcPr>
+          <w:p>
+            <w:r>
+              <w:t>3</w:t>
+            </w:r>
+          </w:p>
+        </w:tc>
+      </w:tr>
+      <w:tr>
+        <w:tc>
+          <w:tcPr>
+            <w:tcW w:type="dxa" w:w="7488"/>
+          </w:tcPr>
+          <w:p>
+            <w:r>
+              <w:t>Figure 2.1: Chronological vs. Shuffled Splitting Data Leakage Concept</w:t>
+            </w:r>
+          </w:p>
+        </w:tc>
+        <w:tc>
+          <w:tcPr>
+            <w:tcW w:type="dxa" w:w="1440"/>
+          </w:tcPr>
+          <w:p>
+            <w:r>
+              <w:t>6</w:t>
+            </w:r>
+          </w:p>
+        </w:tc>
+      </w:tr>
+      <w:tr>
+        <w:tc>
+          <w:tcPr>
+            <w:tcW w:type="dxa" w:w="7488"/>
+          </w:tcPr>
+          <w:p>
+            <w:r>
+              <w:t>Figure 3.1: Model Validation Confusion Matrix for Dataset A (Temporal Test)</w:t>
+            </w:r>
+          </w:p>
+        </w:tc>
+        <w:tc>
+          <w:tcPr>
+            <w:tcW w:type="dxa" w:w="1440"/>
+          </w:tcPr>
+          <w:p>
+            <w:r>
+              <w:t>9</w:t>
+            </w:r>
+          </w:p>
+        </w:tc>
+      </w:tr>
+      <w:tr>
+        <w:tc>
+          <w:tcPr>
+            <w:tcW w:type="dxa" w:w="7488"/>
+          </w:tcPr>
+          <w:p>
+            <w:r>
+              <w:t>Figure 3.2: Model Validation Confusion Matrix for Dataset B (OOD Calibration)</w:t>
+            </w:r>
+          </w:p>
+        </w:tc>
+        <w:tc>
+          <w:tcPr>
+            <w:tcW w:type="dxa" w:w="1440"/>
+          </w:tcPr>
+          <w:p>
+            <w:r>
+              <w:t>10</w:t>
+            </w:r>
+          </w:p>
+        </w:tc>
+      </w:tr>
+      <w:tr>
+        <w:tc>
+          <w:tcPr>
+            <w:tcW w:type="dxa" w:w="7488"/>
+          </w:tcPr>
+          <w:p>
+            <w:r>
+              <w:t>Figure 3.3: Optimization Comparison: File Size and Latency trade-offs</w:t>
+            </w:r>
+          </w:p>
+        </w:tc>
+        <w:tc>
+          <w:tcPr>
+            <w:tcW w:type="dxa" w:w="1440"/>
+          </w:tcPr>
+          <w:p>
+            <w:r>
+              <w:t>11</w:t>
+            </w:r>
+          </w:p>
+        </w:tc>
+      </w:tr>
+      <w:tr>
+        <w:tc>
+          <w:tcPr>
+            <w:tcW w:type="dxa" w:w="7488"/>
+          </w:tcPr>
+          <w:p>
+            <w:r>
+              <w:t>Figure 3.4: Feature Ablation Performance Bar Chart</w:t>
+            </w:r>
+          </w:p>
+        </w:tc>
+        <w:tc>
+          <w:tcPr>
+            <w:tcW w:type="dxa" w:w="1440"/>
+          </w:tcPr>
+          <w:p>
+            <w:r>
+              <w:t>12</w:t>
+            </w:r>
+          </w:p>
+        </w:tc>
+      </w:tr>
+    </w:tbl>
+    <w:p/>
     <w:p>
       <w:r>
         <w:br w:type="page"/>
@@ -390,61 +987,288 @@
       <w:r>
         <w:rPr>
           <w:rFonts w:ascii="Calibri" w:hAnsi="Calibri"/>
-          <w:color w:val="1F4E79"/>
+          <w:color w:val="000000"/>
         </w:rPr>
         <w:t>List of Abbreviations</w:t>
       </w:r>
     </w:p>
-    <w:p>
-      <w:r>
-        <w:t>IDS        —   Intrusion Detection System</w:t>
-        <w:br/>
-      </w:r>
-      <w:r>
-        <w:t>LSTM       —   Long Short-Term Memory</w:t>
-        <w:br/>
-      </w:r>
-      <w:r>
-        <w:t>OOD        —   Out-of-Distribution</w:t>
-        <w:br/>
-      </w:r>
-      <w:r>
-        <w:t>LGBM       —   Light Gradient Boosting Machine</w:t>
-        <w:br/>
-      </w:r>
-      <w:r>
-        <w:t>XGBoost    —   Extreme Gradient Boosting</w:t>
-        <w:br/>
-      </w:r>
-      <w:r>
-        <w:t>FPR        —   False Positive Rate</w:t>
-        <w:br/>
-      </w:r>
-      <w:r>
-        <w:t>FNR        —   False Negative Rate</w:t>
-        <w:br/>
-      </w:r>
-      <w:r>
-        <w:t>JIT        —   Just-In-Time</w:t>
-        <w:br/>
-      </w:r>
-      <w:r>
-        <w:t>INT8       —   8-bit Integer Quantization</w:t>
-        <w:br/>
-      </w:r>
-      <w:r>
-        <w:t>CPU        —   Central Processing Unit</w:t>
-        <w:br/>
-      </w:r>
-      <w:r>
-        <w:t>RAM        —   Random Access Memory</w:t>
-        <w:br/>
-      </w:r>
-      <w:r>
-        <w:t>TCP/IP     —   Transmission Control Protocol / Internet Protocol</w:t>
-        <w:br/>
-      </w:r>
-    </w:p>
+    <w:tbl>
+      <w:tblPr>
+        <w:tblStyle w:val="TableGrid"/>
+        <w:tblW w:type="auto" w:w="0"/>
+        <w:jc w:val="center"/>
+        <w:tblLook w:firstColumn="1" w:firstRow="1" w:lastColumn="0" w:lastRow="0" w:noHBand="0" w:noVBand="1" w:val="04A0"/>
+      </w:tblPr>
+      <w:tblGrid>
+        <w:gridCol w:w="4680"/>
+        <w:gridCol w:w="4680"/>
+      </w:tblGrid>
+      <w:tr>
+        <w:tc>
+          <w:tcPr>
+            <w:tcW w:type="dxa" w:w="2880"/>
+          </w:tcPr>
+          <w:p>
+            <w:r>
+              <w:t>IDS</w:t>
+            </w:r>
+          </w:p>
+        </w:tc>
+        <w:tc>
+          <w:tcPr>
+            <w:tcW w:type="dxa" w:w="6048"/>
+          </w:tcPr>
+          <w:p>
+            <w:r>
+              <w:t>Intrusion Detection System</w:t>
+            </w:r>
+          </w:p>
+        </w:tc>
+      </w:tr>
+      <w:tr>
+        <w:tc>
+          <w:tcPr>
+            <w:tcW w:type="dxa" w:w="2880"/>
+          </w:tcPr>
+          <w:p>
+            <w:r>
+              <w:t>LSTM</w:t>
+            </w:r>
+          </w:p>
+        </w:tc>
+        <w:tc>
+          <w:tcPr>
+            <w:tcW w:type="dxa" w:w="6048"/>
+          </w:tcPr>
+          <w:p>
+            <w:r>
+              <w:t>Long Short-Term Memory</w:t>
+            </w:r>
+          </w:p>
+        </w:tc>
+      </w:tr>
+      <w:tr>
+        <w:tc>
+          <w:tcPr>
+            <w:tcW w:type="dxa" w:w="2880"/>
+          </w:tcPr>
+          <w:p>
+            <w:r>
+              <w:t>OOD</w:t>
+            </w:r>
+          </w:p>
+        </w:tc>
+        <w:tc>
+          <w:tcPr>
+            <w:tcW w:type="dxa" w:w="6048"/>
+          </w:tcPr>
+          <w:p>
+            <w:r>
+              <w:t>Out-of-Distribution</w:t>
+            </w:r>
+          </w:p>
+        </w:tc>
+      </w:tr>
+      <w:tr>
+        <w:tc>
+          <w:tcPr>
+            <w:tcW w:type="dxa" w:w="2880"/>
+          </w:tcPr>
+          <w:p>
+            <w:r>
+              <w:t>LGBM</w:t>
+            </w:r>
+          </w:p>
+        </w:tc>
+        <w:tc>
+          <w:tcPr>
+            <w:tcW w:type="dxa" w:w="6048"/>
+          </w:tcPr>
+          <w:p>
+            <w:r>
+              <w:t>Light Gradient Boosting Machine</w:t>
+            </w:r>
+          </w:p>
+        </w:tc>
+      </w:tr>
+      <w:tr>
+        <w:tc>
+          <w:tcPr>
+            <w:tcW w:type="dxa" w:w="2880"/>
+          </w:tcPr>
+          <w:p>
+            <w:r>
+              <w:t>XGBoost</w:t>
+            </w:r>
+          </w:p>
+        </w:tc>
+        <w:tc>
+          <w:tcPr>
+            <w:tcW w:type="dxa" w:w="6048"/>
+          </w:tcPr>
+          <w:p>
+            <w:r>
+              <w:t>Extreme Gradient Boosting</w:t>
+            </w:r>
+          </w:p>
+        </w:tc>
+      </w:tr>
+      <w:tr>
+        <w:tc>
+          <w:tcPr>
+            <w:tcW w:type="dxa" w:w="2880"/>
+          </w:tcPr>
+          <w:p>
+            <w:r>
+              <w:t>FPR</w:t>
+            </w:r>
+          </w:p>
+        </w:tc>
+        <w:tc>
+          <w:tcPr>
+            <w:tcW w:type="dxa" w:w="6048"/>
+          </w:tcPr>
+          <w:p>
+            <w:r>
+              <w:t>False Positive Rate</w:t>
+            </w:r>
+          </w:p>
+        </w:tc>
+      </w:tr>
+      <w:tr>
+        <w:tc>
+          <w:tcPr>
+            <w:tcW w:type="dxa" w:w="2880"/>
+          </w:tcPr>
+          <w:p>
+            <w:r>
+              <w:t>FNR</w:t>
+            </w:r>
+          </w:p>
+        </w:tc>
+        <w:tc>
+          <w:tcPr>
+            <w:tcW w:type="dxa" w:w="6048"/>
+          </w:tcPr>
+          <w:p>
+            <w:r>
+              <w:t>False Negative Rate</w:t>
+            </w:r>
+          </w:p>
+        </w:tc>
+      </w:tr>
+      <w:tr>
+        <w:tc>
+          <w:tcPr>
+            <w:tcW w:type="dxa" w:w="2880"/>
+          </w:tcPr>
+          <w:p>
+            <w:r>
+              <w:t>JIT</w:t>
+            </w:r>
+          </w:p>
+        </w:tc>
+        <w:tc>
+          <w:tcPr>
+            <w:tcW w:type="dxa" w:w="6048"/>
+          </w:tcPr>
+          <w:p>
+            <w:r>
+              <w:t>Just-In-Time</w:t>
+            </w:r>
+          </w:p>
+        </w:tc>
+      </w:tr>
+      <w:tr>
+        <w:tc>
+          <w:tcPr>
+            <w:tcW w:type="dxa" w:w="2880"/>
+          </w:tcPr>
+          <w:p>
+            <w:r>
+              <w:t>INT8</w:t>
+            </w:r>
+          </w:p>
+        </w:tc>
+        <w:tc>
+          <w:tcPr>
+            <w:tcW w:type="dxa" w:w="6048"/>
+          </w:tcPr>
+          <w:p>
+            <w:r>
+              <w:t>8-bit Integer Quantization</w:t>
+            </w:r>
+          </w:p>
+        </w:tc>
+      </w:tr>
+      <w:tr>
+        <w:tc>
+          <w:tcPr>
+            <w:tcW w:type="dxa" w:w="2880"/>
+          </w:tcPr>
+          <w:p>
+            <w:r>
+              <w:t>CPU</w:t>
+            </w:r>
+          </w:p>
+        </w:tc>
+        <w:tc>
+          <w:tcPr>
+            <w:tcW w:type="dxa" w:w="6048"/>
+          </w:tcPr>
+          <w:p>
+            <w:r>
+              <w:t>Central Processing Unit</w:t>
+            </w:r>
+          </w:p>
+        </w:tc>
+      </w:tr>
+      <w:tr>
+        <w:tc>
+          <w:tcPr>
+            <w:tcW w:type="dxa" w:w="2880"/>
+          </w:tcPr>
+          <w:p>
+            <w:r>
+              <w:t>RAM</w:t>
+            </w:r>
+          </w:p>
+        </w:tc>
+        <w:tc>
+          <w:tcPr>
+            <w:tcW w:type="dxa" w:w="6048"/>
+          </w:tcPr>
+          <w:p>
+            <w:r>
+              <w:t>Random Access Memory</w:t>
+            </w:r>
+          </w:p>
+        </w:tc>
+      </w:tr>
+      <w:tr>
+        <w:tc>
+          <w:tcPr>
+            <w:tcW w:type="dxa" w:w="2880"/>
+          </w:tcPr>
+          <w:p>
+            <w:r>
+              <w:t>TCP/IP</w:t>
+            </w:r>
+          </w:p>
+        </w:tc>
+        <w:tc>
+          <w:tcPr>
+            <w:tcW w:type="dxa" w:w="6048"/>
+          </w:tcPr>
+          <w:p>
+            <w:r>
+              <w:t>Transmission Control Protocol / Internet Protocol</w:t>
+            </w:r>
+          </w:p>
+        </w:tc>
+      </w:tr>
+    </w:tbl>
+    <w:p/>
     <w:p>
       <w:r>
         <w:br w:type="page"/>
@@ -458,14 +1282,14 @@
       <w:r>
         <w:rPr>
           <w:rFonts w:ascii="Calibri" w:hAnsi="Calibri"/>
-          <w:color w:val="1F4E79"/>
+          <w:color w:val="000000"/>
         </w:rPr>
         <w:t>Company &amp; Internship Details</w:t>
       </w:r>
     </w:p>
     <w:tbl>
       <w:tblPr>
-        <w:tblStyle w:val="LightShading-Accent1"/>
+        <w:tblStyle w:val="TableGrid"/>
         <w:tblW w:type="auto" w:w="0"/>
         <w:jc w:val="center"/>
         <w:tblLook w:firstColumn="1" w:firstRow="1" w:lastColumn="0" w:lastRow="0" w:noHBand="0" w:noVBand="1" w:val="04A0"/>
@@ -478,13 +1302,12 @@
         <w:tc>
           <w:tcPr>
             <w:tcW w:type="dxa" w:w="3600"/>
-            <w:shd w:val="clear" w:color="auto" w:fill="1F4E79"/>
           </w:tcPr>
           <w:p>
             <w:r>
               <w:rPr>
                 <w:b/>
-                <w:color w:val="FFFFFF"/>
+                <w:color w:val="000000"/>
               </w:rPr>
               <w:t>Field</w:t>
             </w:r>
@@ -493,13 +1316,12 @@
         <w:tc>
           <w:tcPr>
             <w:tcW w:type="dxa" w:w="5760"/>
-            <w:shd w:val="clear" w:color="auto" w:fill="1F4E79"/>
           </w:tcPr>
           <w:p>
             <w:r>
               <w:rPr>
                 <w:b/>
-                <w:color w:val="FFFFFF"/>
+                <w:color w:val="000000"/>
               </w:rPr>
               <w:t>Details</w:t>
             </w:r>
@@ -741,7 +1563,7 @@
       <w:r>
         <w:rPr>
           <w:rFonts w:ascii="Calibri" w:hAnsi="Calibri"/>
-          <w:color w:val="1F4E79"/>
+          <w:color w:val="000000"/>
         </w:rPr>
         <w:t>GEO-Tagged Photo Evidence</w:t>
       </w:r>
@@ -783,7 +1605,7 @@
       <w:r>
         <w:rPr>
           <w:rFonts w:ascii="Calibri" w:hAnsi="Calibri"/>
-          <w:color w:val="1F4E79"/>
+          <w:color w:val="000000"/>
         </w:rPr>
         <w:t>CHAPTER 1: Introduction</w:t>
       </w:r>
@@ -796,7 +1618,7 @@
       <w:r>
         <w:rPr>
           <w:rFonts w:ascii="Calibri" w:hAnsi="Calibri"/>
-          <w:color w:val="1F4E79"/>
+          <w:color w:val="000000"/>
         </w:rPr>
         <w:t>1.1 Acceptance Criteria</w:t>
       </w:r>
@@ -824,7 +1646,7 @@
       <w:r>
         <w:rPr>
           <w:rFonts w:ascii="Calibri" w:hAnsi="Calibri"/>
-          <w:color w:val="1F4E79"/>
+          <w:color w:val="000000"/>
         </w:rPr>
         <w:t>1.2 Technologies Used</w:t>
       </w:r>
@@ -852,7 +1674,7 @@
       <w:r>
         <w:rPr>
           <w:rFonts w:ascii="Calibri" w:hAnsi="Calibri"/>
-          <w:color w:val="1F4E79"/>
+          <w:color w:val="000000"/>
         </w:rPr>
         <w:t>1.3 Domains Covered</w:t>
       </w:r>
@@ -879,7 +1701,7 @@
       <w:r>
         <w:rPr>
           <w:rFonts w:ascii="Calibri" w:hAnsi="Calibri"/>
-          <w:color w:val="1F4E79"/>
+          <w:color w:val="000000"/>
         </w:rPr>
         <w:t>CHAPTER 2: Project Architecture, Design &amp; Implementation</w:t>
       </w:r>
@@ -892,7 +1714,7 @@
       <w:r>
         <w:rPr>
           <w:rFonts w:ascii="Calibri" w:hAnsi="Calibri"/>
-          <w:color w:val="1F4E79"/>
+          <w:color w:val="000000"/>
         </w:rPr>
         <w:t>2.1 Features Implemented</w:t>
       </w:r>
@@ -910,13 +1732,68 @@
     </w:p>
     <w:p>
       <w:pPr>
+        <w:jc w:val="center"/>
+      </w:pPr>
+    </w:p>
+    <w:p>
+      <w:r>
+        <w:drawing>
+          <wp:inline xmlns:a="http://schemas.openxmlformats.org/drawingml/2006/main" xmlns:pic="http://schemas.openxmlformats.org/drawingml/2006/picture">
+            <wp:extent cx="4572000" cy="3067292"/>
+            <wp:docPr id="1" name="Picture 1"/>
+            <wp:cNvGraphicFramePr>
+              <a:graphicFrameLocks noChangeAspect="1"/>
+            </wp:cNvGraphicFramePr>
+            <a:graphic>
+              <a:graphicData uri="http://schemas.openxmlformats.org/drawingml/2006/picture">
+                <pic:pic>
+                  <pic:nvPicPr>
+                    <pic:cNvPr id="0" name="system_architecture.jpg"/>
+                    <pic:cNvPicPr/>
+                  </pic:nvPicPr>
+                  <pic:blipFill>
+                    <a:blip r:embed="rId9"/>
+                    <a:stretch>
+                      <a:fillRect/>
+                    </a:stretch>
+                  </pic:blipFill>
+                  <pic:spPr>
+                    <a:xfrm>
+                      <a:off x="0" y="0"/>
+                      <a:ext cx="4572000" cy="3067292"/>
+                    </a:xfrm>
+                    <a:prstGeom prst="rect"/>
+                  </pic:spPr>
+                </pic:pic>
+              </a:graphicData>
+            </a:graphic>
+          </wp:inline>
+        </w:drawing>
+      </w:r>
+    </w:p>
+    <w:p>
+      <w:pPr>
+        <w:jc w:val="center"/>
+      </w:pPr>
+      <w:r>
+        <w:rPr>
+          <w:i/>
+          <w:color w:val="000000"/>
+          <w:sz w:val="20"/>
+        </w:rPr>
+        <w:t>Figure 1.1: End-to-End Modular Machine Learning Pipeline Architecture Diagram</w:t>
+      </w:r>
+    </w:p>
+    <w:p/>
+    <w:p>
+      <w:pPr>
         <w:pStyle w:val="Heading2"/>
         <w:spacing w:before="240" w:after="120"/>
       </w:pPr>
       <w:r>
         <w:rPr>
           <w:rFonts w:ascii="Calibri" w:hAnsi="Calibri"/>
-          <w:color w:val="1F4E79"/>
+          <w:color w:val="000000"/>
         </w:rPr>
         <w:t>2.2 Pre-Requisites</w:t>
       </w:r>
@@ -938,7 +1815,7 @@
       <w:r>
         <w:rPr>
           <w:rFonts w:ascii="Calibri" w:hAnsi="Calibri"/>
-          <w:color w:val="1F4E79"/>
+          <w:color w:val="000000"/>
         </w:rPr>
         <w:t>2.3 Implementation Steps</w:t>
       </w:r>
@@ -1044,7 +1921,7 @@
       <w:r>
         <w:rPr>
           <w:rFonts w:ascii="Calibri" w:hAnsi="Calibri"/>
-          <w:color w:val="1F4E79"/>
+          <w:color w:val="000000"/>
         </w:rPr>
         <w:t>CHAPTER 3: Results and Analysis</w:t>
       </w:r>
@@ -1057,7 +1934,7 @@
       <w:r>
         <w:rPr>
           <w:rFonts w:ascii="Calibri" w:hAnsi="Calibri"/>
-          <w:color w:val="1F4E79"/>
+          <w:color w:val="000000"/>
         </w:rPr>
         <w:t>3.1 Performance Evaluation Scorecards</w:t>
       </w:r>
@@ -1069,7 +1946,7 @@
     </w:p>
     <w:tbl>
       <w:tblPr>
-        <w:tblStyle w:val="LightShading-Accent1"/>
+        <w:tblStyle w:val="TableGrid"/>
         <w:tblW w:type="auto" w:w="0"/>
         <w:jc w:val="center"/>
         <w:tblLook w:firstColumn="1" w:firstRow="1" w:lastColumn="0" w:lastRow="0" w:noHBand="0" w:noVBand="1" w:val="04A0"/>
@@ -1089,13 +1966,12 @@
         <w:tc>
           <w:tcPr>
             <w:tcW w:type="dxa" w:w="3168"/>
-            <w:shd w:val="clear" w:color="auto" w:fill="1F4E79"/>
           </w:tcPr>
           <w:p>
             <w:r>
               <w:rPr>
                 <w:b/>
-                <w:color w:val="FFFFFF"/>
+                <w:color w:val="000000"/>
               </w:rPr>
               <w:t>Test Domain</w:t>
             </w:r>
@@ -1104,13 +1980,12 @@
         <w:tc>
           <w:tcPr>
             <w:tcW w:type="dxa" w:w="864"/>
-            <w:shd w:val="clear" w:color="auto" w:fill="1F4E79"/>
           </w:tcPr>
           <w:p>
             <w:r>
               <w:rPr>
                 <w:b/>
-                <w:color w:val="FFFFFF"/>
+                <w:color w:val="000000"/>
               </w:rPr>
               <w:t>F1-Score</w:t>
             </w:r>
@@ -1119,13 +1994,12 @@
         <w:tc>
           <w:tcPr>
             <w:tcW w:type="dxa" w:w="864"/>
-            <w:shd w:val="clear" w:color="auto" w:fill="1F4E79"/>
           </w:tcPr>
           <w:p>
             <w:r>
               <w:rPr>
                 <w:b/>
-                <w:color w:val="FFFFFF"/>
+                <w:color w:val="000000"/>
               </w:rPr>
               <w:t>Accuracy</w:t>
             </w:r>
@@ -1134,13 +2008,12 @@
         <w:tc>
           <w:tcPr>
             <w:tcW w:type="dxa" w:w="864"/>
-            <w:shd w:val="clear" w:color="auto" w:fill="1F4E79"/>
           </w:tcPr>
           <w:p>
             <w:r>
               <w:rPr>
                 <w:b/>
-                <w:color w:val="FFFFFF"/>
+                <w:color w:val="000000"/>
               </w:rPr>
               <w:t>Precision</w:t>
             </w:r>
@@ -1149,13 +2022,12 @@
         <w:tc>
           <w:tcPr>
             <w:tcW w:type="dxa" w:w="864"/>
-            <w:shd w:val="clear" w:color="auto" w:fill="1F4E79"/>
           </w:tcPr>
           <w:p>
             <w:r>
               <w:rPr>
                 <w:b/>
-                <w:color w:val="FFFFFF"/>
+                <w:color w:val="000000"/>
               </w:rPr>
               <w:t>Recall</w:t>
             </w:r>
@@ -1164,13 +2036,12 @@
         <w:tc>
           <w:tcPr>
             <w:tcW w:type="dxa" w:w="864"/>
-            <w:shd w:val="clear" w:color="auto" w:fill="1F4E79"/>
           </w:tcPr>
           <w:p>
             <w:r>
               <w:rPr>
                 <w:b/>
-                <w:color w:val="FFFFFF"/>
+                <w:color w:val="000000"/>
               </w:rPr>
               <w:t>ROC-AUC</w:t>
             </w:r>
@@ -1179,13 +2050,12 @@
         <w:tc>
           <w:tcPr>
             <w:tcW w:type="dxa" w:w="864"/>
-            <w:shd w:val="clear" w:color="auto" w:fill="1F4E79"/>
           </w:tcPr>
           <w:p>
             <w:r>
               <w:rPr>
                 <w:b/>
-                <w:color w:val="FFFFFF"/>
+                <w:color w:val="000000"/>
               </w:rPr>
               <w:t>PR-AUC</w:t>
             </w:r>
@@ -1194,13 +2064,12 @@
         <w:tc>
           <w:tcPr>
             <w:tcW w:type="dxa" w:w="864"/>
-            <w:shd w:val="clear" w:color="auto" w:fill="1F4E79"/>
           </w:tcPr>
           <w:p>
             <w:r>
               <w:rPr>
                 <w:b/>
-                <w:color w:val="FFFFFF"/>
+                <w:color w:val="000000"/>
               </w:rPr>
               <w:t>FPR</w:t>
             </w:r>
@@ -1209,13 +2078,12 @@
         <w:tc>
           <w:tcPr>
             <w:tcW w:type="dxa" w:w="864"/>
-            <w:shd w:val="clear" w:color="auto" w:fill="1F4E79"/>
           </w:tcPr>
           <w:p>
             <w:r>
               <w:rPr>
                 <w:b/>
-                <w:color w:val="FFFFFF"/>
+                <w:color w:val="000000"/>
               </w:rPr>
               <w:t>FNR</w:t>
             </w:r>
@@ -1410,13 +2278,123 @@
     <w:p/>
     <w:p>
       <w:pPr>
+        <w:jc w:val="center"/>
+      </w:pPr>
+    </w:p>
+    <w:p>
+      <w:r>
+        <w:drawing>
+          <wp:inline xmlns:a="http://schemas.openxmlformats.org/drawingml/2006/main" xmlns:pic="http://schemas.openxmlformats.org/drawingml/2006/picture">
+            <wp:extent cx="4114800" cy="4114800"/>
+            <wp:docPr id="2" name="Picture 2"/>
+            <wp:cNvGraphicFramePr>
+              <a:graphicFrameLocks noChangeAspect="1"/>
+            </wp:cNvGraphicFramePr>
+            <a:graphic>
+              <a:graphicData uri="http://schemas.openxmlformats.org/drawingml/2006/picture">
+                <pic:pic>
+                  <pic:nvPicPr>
+                    <pic:cNvPr id="0" name="confusion_matrix_optimized_lstm_dataset_a.png"/>
+                    <pic:cNvPicPr/>
+                  </pic:nvPicPr>
+                  <pic:blipFill>
+                    <a:blip r:embed="rId10"/>
+                    <a:stretch>
+                      <a:fillRect/>
+                    </a:stretch>
+                  </pic:blipFill>
+                  <pic:spPr>
+                    <a:xfrm>
+                      <a:off x="0" y="0"/>
+                      <a:ext cx="4114800" cy="4114800"/>
+                    </a:xfrm>
+                    <a:prstGeom prst="rect"/>
+                  </pic:spPr>
+                </pic:pic>
+              </a:graphicData>
+            </a:graphic>
+          </wp:inline>
+        </w:drawing>
+      </w:r>
+    </w:p>
+    <w:p>
+      <w:pPr>
+        <w:jc w:val="center"/>
+      </w:pPr>
+      <w:r>
+        <w:rPr>
+          <w:i/>
+          <w:color w:val="000000"/>
+          <w:sz w:val="20"/>
+        </w:rPr>
+        <w:t>Figure 3.1: Model Validation Confusion Matrix for Dataset A (Temporal Test)</w:t>
+      </w:r>
+    </w:p>
+    <w:p/>
+    <w:p>
+      <w:pPr>
+        <w:jc w:val="center"/>
+      </w:pPr>
+    </w:p>
+    <w:p>
+      <w:r>
+        <w:drawing>
+          <wp:inline xmlns:a="http://schemas.openxmlformats.org/drawingml/2006/main" xmlns:pic="http://schemas.openxmlformats.org/drawingml/2006/picture">
+            <wp:extent cx="4114800" cy="4114800"/>
+            <wp:docPr id="3" name="Picture 3"/>
+            <wp:cNvGraphicFramePr>
+              <a:graphicFrameLocks noChangeAspect="1"/>
+            </wp:cNvGraphicFramePr>
+            <a:graphic>
+              <a:graphicData uri="http://schemas.openxmlformats.org/drawingml/2006/picture">
+                <pic:pic>
+                  <pic:nvPicPr>
+                    <pic:cNvPr id="0" name="confusion_matrix_optimized_lstm_dataset_b.png"/>
+                    <pic:cNvPicPr/>
+                  </pic:nvPicPr>
+                  <pic:blipFill>
+                    <a:blip r:embed="rId11"/>
+                    <a:stretch>
+                      <a:fillRect/>
+                    </a:stretch>
+                  </pic:blipFill>
+                  <pic:spPr>
+                    <a:xfrm>
+                      <a:off x="0" y="0"/>
+                      <a:ext cx="4114800" cy="4114800"/>
+                    </a:xfrm>
+                    <a:prstGeom prst="rect"/>
+                  </pic:spPr>
+                </pic:pic>
+              </a:graphicData>
+            </a:graphic>
+          </wp:inline>
+        </w:drawing>
+      </w:r>
+    </w:p>
+    <w:p>
+      <w:pPr>
+        <w:jc w:val="center"/>
+      </w:pPr>
+      <w:r>
+        <w:rPr>
+          <w:i/>
+          <w:color w:val="000000"/>
+          <w:sz w:val="20"/>
+        </w:rPr>
+        <w:t>Figure 3.2: Model Validation Confusion Matrix for Dataset B (OOD Calibration)</w:t>
+      </w:r>
+    </w:p>
+    <w:p/>
+    <w:p>
+      <w:pPr>
         <w:pStyle w:val="Heading2"/>
         <w:spacing w:before="240" w:after="120"/>
       </w:pPr>
       <w:r>
         <w:rPr>
           <w:rFonts w:ascii="Calibri" w:hAnsi="Calibri"/>
-          <w:color w:val="1F4E79"/>
+          <w:color w:val="000000"/>
         </w:rPr>
         <w:t>3.2 System Performance &amp; Footprint Scorecard</w:t>
       </w:r>
@@ -1428,7 +2406,7 @@
     </w:p>
     <w:tbl>
       <w:tblPr>
-        <w:tblStyle w:val="LightShading-Accent1"/>
+        <w:tblStyle w:val="TableGrid"/>
         <w:tblW w:type="auto" w:w="0"/>
         <w:jc w:val="center"/>
         <w:tblLook w:firstColumn="1" w:firstRow="1" w:lastColumn="0" w:lastRow="0" w:noHBand="0" w:noVBand="1" w:val="04A0"/>
@@ -1443,13 +2421,12 @@
         <w:tc>
           <w:tcPr>
             <w:tcW w:type="dxa" w:w="3168"/>
-            <w:shd w:val="clear" w:color="auto" w:fill="1F4E79"/>
           </w:tcPr>
           <w:p>
             <w:r>
               <w:rPr>
                 <w:b/>
-                <w:color w:val="FFFFFF"/>
+                <w:color w:val="000000"/>
               </w:rPr>
               <w:t>Metric</w:t>
             </w:r>
@@ -1458,13 +2435,12 @@
         <w:tc>
           <w:tcPr>
             <w:tcW w:type="dxa" w:w="2160"/>
-            <w:shd w:val="clear" w:color="auto" w:fill="1F4E79"/>
           </w:tcPr>
           <w:p>
             <w:r>
               <w:rPr>
                 <w:b/>
-                <w:color w:val="FFFFFF"/>
+                <w:color w:val="000000"/>
               </w:rPr>
               <w:t>Dataset A (Temporal)</w:t>
             </w:r>
@@ -1473,13 +2449,12 @@
         <w:tc>
           <w:tcPr>
             <w:tcW w:type="dxa" w:w="2160"/>
-            <w:shd w:val="clear" w:color="auto" w:fill="1F4E79"/>
           </w:tcPr>
           <w:p>
             <w:r>
               <w:rPr>
                 <w:b/>
-                <w:color w:val="FFFFFF"/>
+                <w:color w:val="000000"/>
               </w:rPr>
               <w:t>Dataset B (OOD Log)</w:t>
             </w:r>
@@ -1488,13 +2463,12 @@
         <w:tc>
           <w:tcPr>
             <w:tcW w:type="dxa" w:w="2160"/>
-            <w:shd w:val="clear" w:color="auto" w:fill="1F4E79"/>
           </w:tcPr>
           <w:p>
             <w:r>
               <w:rPr>
                 <w:b/>
-                <w:color w:val="FFFFFF"/>
+                <w:color w:val="000000"/>
               </w:rPr>
               <w:t>Live Traffic (Sniffed)</w:t>
             </w:r>
@@ -2015,7 +2989,7 @@
       <w:r>
         <w:rPr>
           <w:rFonts w:ascii="Calibri" w:hAnsi="Calibri"/>
-          <w:color w:val="1F4E79"/>
+          <w:color w:val="000000"/>
         </w:rPr>
         <w:t>3.3 Model Optimization Benchmarks</w:t>
       </w:r>
@@ -2027,7 +3001,7 @@
     </w:p>
     <w:tbl>
       <w:tblPr>
-        <w:tblStyle w:val="LightShading-Accent1"/>
+        <w:tblStyle w:val="TableGrid"/>
         <w:tblW w:type="auto" w:w="0"/>
         <w:jc w:val="center"/>
         <w:tblLook w:firstColumn="1" w:firstRow="1" w:lastColumn="0" w:lastRow="0" w:noHBand="0" w:noVBand="1" w:val="04A0"/>
@@ -2044,13 +3018,12 @@
         <w:tc>
           <w:tcPr>
             <w:tcW w:type="dxa" w:w="3168"/>
-            <w:shd w:val="clear" w:color="auto" w:fill="1F4E79"/>
           </w:tcPr>
           <w:p>
             <w:r>
               <w:rPr>
                 <w:b/>
-                <w:color w:val="FFFFFF"/>
+                <w:color w:val="000000"/>
               </w:rPr>
               <w:t>LSTM Variant</w:t>
             </w:r>
@@ -2059,13 +3032,12 @@
         <w:tc>
           <w:tcPr>
             <w:tcW w:type="dxa" w:w="1296"/>
-            <w:shd w:val="clear" w:color="auto" w:fill="1F4E79"/>
           </w:tcPr>
           <w:p>
             <w:r>
               <w:rPr>
                 <w:b/>
-                <w:color w:val="FFFFFF"/>
+                <w:color w:val="000000"/>
               </w:rPr>
               <w:t>F1-Score</w:t>
             </w:r>
@@ -2074,13 +3046,12 @@
         <w:tc>
           <w:tcPr>
             <w:tcW w:type="dxa" w:w="1296"/>
-            <w:shd w:val="clear" w:color="auto" w:fill="1F4E79"/>
           </w:tcPr>
           <w:p>
             <w:r>
               <w:rPr>
                 <w:b/>
-                <w:color w:val="FFFFFF"/>
+                <w:color w:val="000000"/>
               </w:rPr>
               <w:t>Accuracy</w:t>
             </w:r>
@@ -2089,13 +3060,12 @@
         <w:tc>
           <w:tcPr>
             <w:tcW w:type="dxa" w:w="1296"/>
-            <w:shd w:val="clear" w:color="auto" w:fill="1F4E79"/>
           </w:tcPr>
           <w:p>
             <w:r>
               <w:rPr>
                 <w:b/>
-                <w:color w:val="FFFFFF"/>
+                <w:color w:val="000000"/>
               </w:rPr>
               <w:t>Latency</w:t>
             </w:r>
@@ -2104,13 +3074,12 @@
         <w:tc>
           <w:tcPr>
             <w:tcW w:type="dxa" w:w="1296"/>
-            <w:shd w:val="clear" w:color="auto" w:fill="1F4E79"/>
           </w:tcPr>
           <w:p>
             <w:r>
               <w:rPr>
                 <w:b/>
-                <w:color w:val="FFFFFF"/>
+                <w:color w:val="000000"/>
               </w:rPr>
               <w:t>File Size</w:t>
             </w:r>
@@ -2119,13 +3088,12 @@
         <w:tc>
           <w:tcPr>
             <w:tcW w:type="dxa" w:w="1296"/>
-            <w:shd w:val="clear" w:color="auto" w:fill="1F4E79"/>
           </w:tcPr>
           <w:p>
             <w:r>
               <w:rPr>
                 <w:b/>
-                <w:color w:val="FFFFFF"/>
+                <w:color w:val="000000"/>
               </w:rPr>
               <w:t>Speedup</w:t>
             </w:r>
@@ -2384,13 +3352,68 @@
     <w:p/>
     <w:p>
       <w:pPr>
+        <w:jc w:val="center"/>
+      </w:pPr>
+    </w:p>
+    <w:p>
+      <w:r>
+        <w:drawing>
+          <wp:inline xmlns:a="http://schemas.openxmlformats.org/drawingml/2006/main" xmlns:pic="http://schemas.openxmlformats.org/drawingml/2006/picture">
+            <wp:extent cx="4572000" cy="2286000"/>
+            <wp:docPr id="4" name="Picture 4"/>
+            <wp:cNvGraphicFramePr>
+              <a:graphicFrameLocks noChangeAspect="1"/>
+            </wp:cNvGraphicFramePr>
+            <a:graphic>
+              <a:graphicData uri="http://schemas.openxmlformats.org/drawingml/2006/picture">
+                <pic:pic>
+                  <pic:nvPicPr>
+                    <pic:cNvPr id="0" name="three_way_comparison.png"/>
+                    <pic:cNvPicPr/>
+                  </pic:nvPicPr>
+                  <pic:blipFill>
+                    <a:blip r:embed="rId12"/>
+                    <a:stretch>
+                      <a:fillRect/>
+                    </a:stretch>
+                  </pic:blipFill>
+                  <pic:spPr>
+                    <a:xfrm>
+                      <a:off x="0" y="0"/>
+                      <a:ext cx="4572000" cy="2286000"/>
+                    </a:xfrm>
+                    <a:prstGeom prst="rect"/>
+                  </pic:spPr>
+                </pic:pic>
+              </a:graphicData>
+            </a:graphic>
+          </wp:inline>
+        </w:drawing>
+      </w:r>
+    </w:p>
+    <w:p>
+      <w:pPr>
+        <w:jc w:val="center"/>
+      </w:pPr>
+      <w:r>
+        <w:rPr>
+          <w:i/>
+          <w:color w:val="000000"/>
+          <w:sz w:val="20"/>
+        </w:rPr>
+        <w:t>Figure 3.3: System Resource and Optimization Footprints</w:t>
+      </w:r>
+    </w:p>
+    <w:p/>
+    <w:p>
+      <w:pPr>
         <w:pStyle w:val="Heading2"/>
         <w:spacing w:before="240" w:after="120"/>
       </w:pPr>
       <w:r>
         <w:rPr>
           <w:rFonts w:ascii="Calibri" w:hAnsi="Calibri"/>
-          <w:color w:val="1F4E79"/>
+          <w:color w:val="000000"/>
         </w:rPr>
         <w:t>3.4 Feature &amp; Capacity Ablation Table</w:t>
       </w:r>
@@ -2402,7 +3425,7 @@
     </w:p>
     <w:tbl>
       <w:tblPr>
-        <w:tblStyle w:val="LightShading-Accent1"/>
+        <w:tblStyle w:val="TableGrid"/>
         <w:tblW w:type="auto" w:w="0"/>
         <w:jc w:val="center"/>
         <w:tblLook w:firstColumn="1" w:firstRow="1" w:lastColumn="0" w:lastRow="0" w:noHBand="0" w:noVBand="1" w:val="04A0"/>
@@ -2419,13 +3442,12 @@
         <w:tc>
           <w:tcPr>
             <w:tcW w:type="dxa" w:w="3168"/>
-            <w:shd w:val="clear" w:color="auto" w:fill="1F4E79"/>
           </w:tcPr>
           <w:p>
             <w:r>
               <w:rPr>
                 <w:b/>
-                <w:color w:val="FFFFFF"/>
+                <w:color w:val="000000"/>
               </w:rPr>
               <w:t>Experiment Name</w:t>
             </w:r>
@@ -2434,13 +3456,12 @@
         <w:tc>
           <w:tcPr>
             <w:tcW w:type="dxa" w:w="1296"/>
-            <w:shd w:val="clear" w:color="auto" w:fill="1F4E79"/>
           </w:tcPr>
           <w:p>
             <w:r>
               <w:rPr>
                 <w:b/>
-                <w:color w:val="FFFFFF"/>
+                <w:color w:val="000000"/>
               </w:rPr>
               <w:t>F1-Score</w:t>
             </w:r>
@@ -2449,13 +3470,12 @@
         <w:tc>
           <w:tcPr>
             <w:tcW w:type="dxa" w:w="1296"/>
-            <w:shd w:val="clear" w:color="auto" w:fill="1F4E79"/>
           </w:tcPr>
           <w:p>
             <w:r>
               <w:rPr>
                 <w:b/>
-                <w:color w:val="FFFFFF"/>
+                <w:color w:val="000000"/>
               </w:rPr>
               <w:t>FPR</w:t>
             </w:r>
@@ -2464,13 +3484,12 @@
         <w:tc>
           <w:tcPr>
             <w:tcW w:type="dxa" w:w="1296"/>
-            <w:shd w:val="clear" w:color="auto" w:fill="1F4E79"/>
           </w:tcPr>
           <w:p>
             <w:r>
               <w:rPr>
                 <w:b/>
-                <w:color w:val="FFFFFF"/>
+                <w:color w:val="000000"/>
               </w:rPr>
               <w:t>Latency</w:t>
             </w:r>
@@ -2479,13 +3498,12 @@
         <w:tc>
           <w:tcPr>
             <w:tcW w:type="dxa" w:w="1296"/>
-            <w:shd w:val="clear" w:color="auto" w:fill="1F4E79"/>
           </w:tcPr>
           <w:p>
             <w:r>
               <w:rPr>
                 <w:b/>
-                <w:color w:val="FFFFFF"/>
+                <w:color w:val="000000"/>
               </w:rPr>
               <w:t>F1 Delta</w:t>
             </w:r>
@@ -2494,13 +3512,12 @@
         <w:tc>
           <w:tcPr>
             <w:tcW w:type="dxa" w:w="1296"/>
-            <w:shd w:val="clear" w:color="auto" w:fill="1F4E79"/>
           </w:tcPr>
           <w:p>
             <w:r>
               <w:rPr>
                 <w:b/>
-                <w:color w:val="FFFFFF"/>
+                <w:color w:val="000000"/>
               </w:rPr>
               <w:t>FPR Delta</w:t>
             </w:r>
@@ -2824,6 +3841,61 @@
       </w:r>
     </w:p>
     <w:p>
+      <w:pPr>
+        <w:jc w:val="center"/>
+      </w:pPr>
+    </w:p>
+    <w:p>
+      <w:r>
+        <w:drawing>
+          <wp:inline xmlns:a="http://schemas.openxmlformats.org/drawingml/2006/main" xmlns:pic="http://schemas.openxmlformats.org/drawingml/2006/picture">
+            <wp:extent cx="4572000" cy="2743200"/>
+            <wp:docPr id="5" name="Picture 5"/>
+            <wp:cNvGraphicFramePr>
+              <a:graphicFrameLocks noChangeAspect="1"/>
+            </wp:cNvGraphicFramePr>
+            <a:graphic>
+              <a:graphicData uri="http://schemas.openxmlformats.org/drawingml/2006/picture">
+                <pic:pic>
+                  <pic:nvPicPr>
+                    <pic:cNvPr id="0" name="ablation_study_comparison.png"/>
+                    <pic:cNvPicPr/>
+                  </pic:nvPicPr>
+                  <pic:blipFill>
+                    <a:blip r:embed="rId13"/>
+                    <a:stretch>
+                      <a:fillRect/>
+                    </a:stretch>
+                  </pic:blipFill>
+                  <pic:spPr>
+                    <a:xfrm>
+                      <a:off x="0" y="0"/>
+                      <a:ext cx="4572000" cy="2743200"/>
+                    </a:xfrm>
+                    <a:prstGeom prst="rect"/>
+                  </pic:spPr>
+                </pic:pic>
+              </a:graphicData>
+            </a:graphic>
+          </wp:inline>
+        </w:drawing>
+      </w:r>
+    </w:p>
+    <w:p>
+      <w:pPr>
+        <w:jc w:val="center"/>
+      </w:pPr>
+      <w:r>
+        <w:rPr>
+          <w:i/>
+          <w:color w:val="000000"/>
+          <w:sz w:val="20"/>
+        </w:rPr>
+        <w:t>Figure 3.4: Feature Ablation Performance Bar Chart</w:t>
+      </w:r>
+    </w:p>
+    <w:p/>
+    <w:p>
       <w:r>
         <w:br w:type="page"/>
       </w:r>
@@ -2836,7 +3908,7 @@
       <w:r>
         <w:rPr>
           <w:rFonts w:ascii="Calibri" w:hAnsi="Calibri"/>
-          <w:color w:val="1F4E79"/>
+          <w:color w:val="000000"/>
         </w:rPr>
         <w:t>CHAPTER 4: Learning Outcomes</w:t>
       </w:r>
@@ -2849,7 +3921,7 @@
       <w:r>
         <w:rPr>
           <w:rFonts w:ascii="Calibri" w:hAnsi="Calibri"/>
-          <w:color w:val="1F4E79"/>
+          <w:color w:val="000000"/>
         </w:rPr>
         <w:t>4.1 Project Learning Outcomes</w:t>
       </w:r>
@@ -2871,7 +3943,7 @@
       <w:r>
         <w:rPr>
           <w:rFonts w:ascii="Calibri" w:hAnsi="Calibri"/>
-          <w:color w:val="1F4E79"/>
+          <w:color w:val="000000"/>
         </w:rPr>
         <w:t>4.2 Internship Learning Outcomes</w:t>
       </w:r>
@@ -2893,7 +3965,7 @@
       <w:r>
         <w:rPr>
           <w:rFonts w:ascii="Calibri" w:hAnsi="Calibri"/>
-          <w:color w:val="1F4E79"/>
+          <w:color w:val="000000"/>
         </w:rPr>
         <w:t>4.3 Skills Acquired</w:t>
       </w:r>
@@ -2905,7 +3977,7 @@
     </w:p>
     <w:tbl>
       <w:tblPr>
-        <w:tblStyle w:val="LightShading-Accent1"/>
+        <w:tblStyle w:val="TableGrid"/>
         <w:tblW w:type="auto" w:w="0"/>
         <w:jc w:val="center"/>
         <w:tblLook w:firstColumn="1" w:firstRow="1" w:lastColumn="0" w:lastRow="0" w:noHBand="0" w:noVBand="1" w:val="04A0"/>
@@ -2918,13 +3990,12 @@
         <w:tc>
           <w:tcPr>
             <w:tcW w:type="dxa" w:w="4608"/>
-            <w:shd w:val="clear" w:color="auto" w:fill="1F4E79"/>
           </w:tcPr>
           <w:p>
             <w:r>
               <w:rPr>
                 <w:b/>
-                <w:color w:val="FFFFFF"/>
+                <w:color w:val="000000"/>
               </w:rPr>
               <w:t>Technical Skills</w:t>
             </w:r>
@@ -2933,13 +4004,12 @@
         <w:tc>
           <w:tcPr>
             <w:tcW w:type="dxa" w:w="4608"/>
-            <w:shd w:val="clear" w:color="auto" w:fill="1F4E79"/>
           </w:tcPr>
           <w:p>
             <w:r>
               <w:rPr>
                 <w:b/>
-                <w:color w:val="FFFFFF"/>
+                <w:color w:val="000000"/>
               </w:rPr>
               <w:t>Soft Skills</w:t>
             </w:r>
@@ -3066,7 +4136,7 @@
       <w:r>
         <w:rPr>
           <w:rFonts w:ascii="Calibri" w:hAnsi="Calibri"/>
-          <w:color w:val="1F4E79"/>
+          <w:color w:val="000000"/>
         </w:rPr>
         <w:t>4.4 Best Learning from this Internship</w:t>
       </w:r>
@@ -3089,7 +4159,7 @@
       <w:r>
         <w:rPr>
           <w:rFonts w:ascii="Calibri" w:hAnsi="Calibri"/>
-          <w:color w:val="1F4E79"/>
+          <w:color w:val="000000"/>
         </w:rPr>
         <w:t>CHAPTER 5: Conclusion</w:t>
       </w:r>
@@ -3110,7 +4180,7 @@
       <w:r>
         <w:rPr>
           <w:rFonts w:ascii="Calibri" w:hAnsi="Calibri"/>
-          <w:color w:val="1F4E79"/>
+          <w:color w:val="000000"/>
         </w:rPr>
         <w:t>5.2 Feedback</w:t>
       </w:r>
@@ -3132,7 +4202,7 @@
       <w:r>
         <w:rPr>
           <w:rFonts w:ascii="Calibri" w:hAnsi="Calibri"/>
-          <w:color w:val="1F4E79"/>
+          <w:color w:val="000000"/>
         </w:rPr>
         <w:t>5.3 Declaration &amp; Signature</w:t>
       </w:r>
@@ -3170,7 +4240,7 @@
       <w:r>
         <w:rPr>
           <w:rFonts w:ascii="Calibri" w:hAnsi="Calibri"/>
-          <w:color w:val="1F4E79"/>
+          <w:color w:val="000000"/>
         </w:rPr>
         <w:t>References</w:t>
       </w:r>

</xml_diff>

<commit_message>
Configure 60:40 calibration split, regenerate scoring logs and update report tables/figures
</commit_message>
<xml_diff>
--- a/internship_report.docx
+++ b/internship_report.docx
@@ -1804,7 +1804,7 @@
         <w:br/>
         <w:t>pip install pandas numpy scikit-learn xgboost lightgbm torch matplotlib psutil scapy</w:t>
         <w:br/>
-        <w:t>The raw logs (conn.log.train_20_80, conn.log.test_90_10, conn.log.calibration_90_10) must be placed in the project root directory.</w:t>
+        <w:t>The raw logs (conn.log.train_20_80, conn.log.test_90_10, conn.log.calibration_60_40) must be placed in the project root directory.</w:t>
       </w:r>
     </w:p>
     <w:p>
@@ -1828,7 +1828,7 @@
         <w:t xml:space="preserve">* Step 1: Profiling and Chronological Splitting: </w:t>
       </w:r>
       <w:r>
-        <w:t>Profile class counts and establish temporal boundaries. Read raw splits, map string labels into benign boolean flags, and sample validation and test partitions into a standard 90:10 benign-to-malicious imbalance ratio. Saves: conn.log.train_20_80, conn.log.test_90_10, conn.log.calibration_90_10.</w:t>
+        <w:t>Profile class counts and establish temporal boundaries. Read raw splits, map string labels into benign boolean flags, and sample validation and test partitions into custom ratios (90:10 for test and 60:40 for validation/calibration). Saves: conn.log.train_20_80, conn.log.test_90_10, conn.log.calibration_60_40.</w:t>
       </w:r>
     </w:p>
     <w:p>
@@ -2107,7 +2107,7 @@
           </w:tcPr>
           <w:p>
             <w:r>
-              <w:t>0.2540</w:t>
+              <w:t>0.2573</w:t>
             </w:r>
           </w:p>
         </w:tc>
@@ -2117,7 +2117,7 @@
           </w:tcPr>
           <w:p>
             <w:r>
-              <w:t>0.4765</w:t>
+              <w:t>0.4855</w:t>
             </w:r>
           </w:p>
         </w:tc>
@@ -2127,7 +2127,7 @@
           </w:tcPr>
           <w:p>
             <w:r>
-              <w:t>0.1480</w:t>
+              <w:t>0.1503</w:t>
             </w:r>
           </w:p>
         </w:tc>
@@ -2147,7 +2147,7 @@
           </w:tcPr>
           <w:p>
             <w:r>
-              <w:t>0.6731</w:t>
+              <w:t>0.6730</w:t>
             </w:r>
           </w:p>
         </w:tc>
@@ -2157,7 +2157,7 @@
           </w:tcPr>
           <w:p>
             <w:r>
-              <w:t>0.3057</w:t>
+              <w:t>0.4386</w:t>
             </w:r>
           </w:p>
         </w:tc>
@@ -2167,7 +2167,7 @@
           </w:tcPr>
           <w:p>
             <w:r>
-              <w:t>0.5697</w:t>
+              <w:t>0.5597</w:t>
             </w:r>
           </w:p>
         </w:tc>
@@ -2199,7 +2199,7 @@
           </w:tcPr>
           <w:p>
             <w:r>
-              <w:t>0.0476</w:t>
+              <w:t>0.1148</w:t>
             </w:r>
           </w:p>
         </w:tc>
@@ -2209,7 +2209,7 @@
           </w:tcPr>
           <w:p>
             <w:r>
-              <w:t>0.5552</w:t>
+              <w:t>0.4071</w:t>
             </w:r>
           </w:p>
         </w:tc>
@@ -2219,7 +2219,7 @@
           </w:tcPr>
           <w:p>
             <w:r>
-              <w:t>0.0303</w:t>
+              <w:t>0.1429</w:t>
             </w:r>
           </w:p>
         </w:tc>
@@ -2229,7 +2229,7 @@
           </w:tcPr>
           <w:p>
             <w:r>
-              <w:t>0.1110</w:t>
+              <w:t>0.0960</w:t>
             </w:r>
           </w:p>
         </w:tc>
@@ -2239,7 +2239,7 @@
           </w:tcPr>
           <w:p>
             <w:r>
-              <w:t>0.2980</w:t>
+              <w:t>0.2686</w:t>
             </w:r>
           </w:p>
         </w:tc>
@@ -2249,7 +2249,7 @@
           </w:tcPr>
           <w:p>
             <w:r>
-              <w:t>0.1047</w:t>
+              <w:t>0.2977</w:t>
             </w:r>
           </w:p>
         </w:tc>
@@ -2259,7 +2259,7 @@
           </w:tcPr>
           <w:p>
             <w:r>
-              <w:t>0.3954</w:t>
+              <w:t>0.3850</w:t>
             </w:r>
           </w:p>
         </w:tc>
@@ -2269,7 +2269,7 @@
           </w:tcPr>
           <w:p>
             <w:r>
-              <w:t>0.8890</w:t>
+              <w:t>0.9040</w:t>
             </w:r>
           </w:p>
         </w:tc>
@@ -2492,7 +2492,7 @@
           </w:tcPr>
           <w:p>
             <w:r>
-              <w:t>0.4765</w:t>
+              <w:t>0.4855</w:t>
             </w:r>
           </w:p>
         </w:tc>
@@ -2502,7 +2502,7 @@
           </w:tcPr>
           <w:p>
             <w:r>
-              <w:t>0.5552</w:t>
+              <w:t>0.4071</w:t>
             </w:r>
           </w:p>
         </w:tc>
@@ -2512,7 +2512,7 @@
           </w:tcPr>
           <w:p>
             <w:r>
-              <w:t>1.0000</w:t>
+              <w:t>0.9545</w:t>
             </w:r>
           </w:p>
         </w:tc>
@@ -2534,7 +2534,7 @@
           </w:tcPr>
           <w:p>
             <w:r>
-              <w:t>0.1480</w:t>
+              <w:t>0.1503</w:t>
             </w:r>
           </w:p>
         </w:tc>
@@ -2544,7 +2544,7 @@
           </w:tcPr>
           <w:p>
             <w:r>
-              <w:t>0.0303</w:t>
+              <w:t>0.1429</w:t>
             </w:r>
           </w:p>
         </w:tc>
@@ -2586,7 +2586,7 @@
           </w:tcPr>
           <w:p>
             <w:r>
-              <w:t>0.1110</w:t>
+              <w:t>0.0960</w:t>
             </w:r>
           </w:p>
         </w:tc>
@@ -2596,7 +2596,7 @@
           </w:tcPr>
           <w:p>
             <w:r>
-              <w:t>1.0000</w:t>
+              <w:t>0.5000</w:t>
             </w:r>
           </w:p>
         </w:tc>
@@ -2618,7 +2618,7 @@
           </w:tcPr>
           <w:p>
             <w:r>
-              <w:t>0.2540</w:t>
+              <w:t>0.2573</w:t>
             </w:r>
           </w:p>
         </w:tc>
@@ -2628,7 +2628,7 @@
           </w:tcPr>
           <w:p>
             <w:r>
-              <w:t>0.0476</w:t>
+              <w:t>0.1148</w:t>
             </w:r>
           </w:p>
         </w:tc>
@@ -2638,7 +2638,7 @@
           </w:tcPr>
           <w:p>
             <w:r>
-              <w:t>1.0000</w:t>
+              <w:t>0.6667</w:t>
             </w:r>
           </w:p>
         </w:tc>
@@ -2660,7 +2660,7 @@
           </w:tcPr>
           <w:p>
             <w:r>
-              <w:t>0.6731</w:t>
+              <w:t>0.6730</w:t>
             </w:r>
           </w:p>
         </w:tc>
@@ -2670,7 +2670,7 @@
           </w:tcPr>
           <w:p>
             <w:r>
-              <w:t>0.2980</w:t>
+              <w:t>0.2686</w:t>
             </w:r>
           </w:p>
         </w:tc>
@@ -2680,7 +2680,7 @@
           </w:tcPr>
           <w:p>
             <w:r>
-              <w:t>1.0000</w:t>
+              <w:t>0.9583</w:t>
             </w:r>
           </w:p>
         </w:tc>
@@ -2702,7 +2702,7 @@
           </w:tcPr>
           <w:p>
             <w:r>
-              <w:t>0.3057</w:t>
+              <w:t>0.4386</w:t>
             </w:r>
           </w:p>
         </w:tc>
@@ -2712,7 +2712,7 @@
           </w:tcPr>
           <w:p>
             <w:r>
-              <w:t>0.1047</w:t>
+              <w:t>0.2977</w:t>
             </w:r>
           </w:p>
         </w:tc>
@@ -2722,7 +2722,7 @@
           </w:tcPr>
           <w:p>
             <w:r>
-              <w:t>1.0000</w:t>
+              <w:t>0.7388</w:t>
             </w:r>
           </w:p>
         </w:tc>
@@ -2744,7 +2744,7 @@
           </w:tcPr>
           <w:p>
             <w:r>
-              <w:t>0.5697</w:t>
+              <w:t>0.5597</w:t>
             </w:r>
           </w:p>
         </w:tc>
@@ -2754,7 +2754,7 @@
           </w:tcPr>
           <w:p>
             <w:r>
-              <w:t>0.3954</w:t>
+              <w:t>0.3850</w:t>
             </w:r>
           </w:p>
         </w:tc>
@@ -2796,7 +2796,7 @@
           </w:tcPr>
           <w:p>
             <w:r>
-              <w:t>0.8890</w:t>
+              <w:t>0.9040</w:t>
             </w:r>
           </w:p>
         </w:tc>
@@ -2806,7 +2806,7 @@
           </w:tcPr>
           <w:p>
             <w:r>
-              <w:t>0.0000</w:t>
+              <w:t>0.5000</w:t>
             </w:r>
           </w:p>
         </w:tc>
@@ -2828,7 +2828,7 @@
           </w:tcPr>
           <w:p>
             <w:r>
-              <w:t>0.0038 ms/smp</w:t>
+              <w:t>0.0053 ms/smp</w:t>
             </w:r>
           </w:p>
         </w:tc>
@@ -2838,7 +2838,7 @@
           </w:tcPr>
           <w:p>
             <w:r>
-              <w:t>0.0047 ms/smp</w:t>
+              <w:t>0.0066 ms/smp</w:t>
             </w:r>
           </w:p>
         </w:tc>
@@ -2848,7 +2848,7 @@
           </w:tcPr>
           <w:p>
             <w:r>
-              <w:t>0.4735 ms/smp</w:t>
+              <w:t>0.1635 ms/smp</w:t>
             </w:r>
           </w:p>
         </w:tc>
@@ -2870,7 +2870,7 @@
           </w:tcPr>
           <w:p>
             <w:r>
-              <w:t>51.1%</w:t>
+              <w:t>43.8%</w:t>
             </w:r>
           </w:p>
         </w:tc>
@@ -2880,7 +2880,7 @@
           </w:tcPr>
           <w:p>
             <w:r>
-              <w:t>51.1%</w:t>
+              <w:t>43.8%</w:t>
             </w:r>
           </w:p>
         </w:tc>
@@ -2890,7 +2890,7 @@
           </w:tcPr>
           <w:p>
             <w:r>
-              <w:t>40.5%</w:t>
+              <w:t>39.4%</w:t>
             </w:r>
           </w:p>
         </w:tc>
@@ -2912,7 +2912,7 @@
           </w:tcPr>
           <w:p>
             <w:r>
-              <w:t>434.09 MB</w:t>
+              <w:t>389.21 MB</w:t>
             </w:r>
           </w:p>
         </w:tc>
@@ -2922,7 +2922,7 @@
           </w:tcPr>
           <w:p>
             <w:r>
-              <w:t>434.09 MB</w:t>
+              <w:t>389.21 MB</w:t>
             </w:r>
           </w:p>
         </w:tc>
@@ -2932,7 +2932,7 @@
           </w:tcPr>
           <w:p>
             <w:r>
-              <w:t>453.26 MB</w:t>
+              <w:t>405.34 MB</w:t>
             </w:r>
           </w:p>
         </w:tc>
@@ -2974,7 +2974,7 @@
           </w:tcPr>
           <w:p>
             <w:r>
-              <w:t>259.0 pkts/s</w:t>
+              <w:t>1035.0 pkts/s</w:t>
             </w:r>
           </w:p>
         </w:tc>
@@ -3117,7 +3117,7 @@
           </w:tcPr>
           <w:p>
             <w:r>
-              <w:t>0.2553</w:t>
+              <w:t>0.1148</w:t>
             </w:r>
           </w:p>
         </w:tc>
@@ -3127,7 +3127,7 @@
           </w:tcPr>
           <w:p>
             <w:r>
-              <w:t>0.4799</w:t>
+              <w:t>0.4071</w:t>
             </w:r>
           </w:p>
         </w:tc>
@@ -3137,7 +3137,7 @@
           </w:tcPr>
           <w:p>
             <w:r>
-              <w:t>1.85 us/pkt</w:t>
+              <w:t>1.91 us/pkt</w:t>
             </w:r>
           </w:p>
         </w:tc>
@@ -3189,7 +3189,7 @@
           </w:tcPr>
           <w:p>
             <w:r>
-              <w:t>0.9000</w:t>
+              <w:t>0.5994</w:t>
             </w:r>
           </w:p>
         </w:tc>
@@ -3199,7 +3199,7 @@
           </w:tcPr>
           <w:p>
             <w:r>
-              <w:t>1.20 us/pkt</w:t>
+              <w:t>2.08 us/pkt</w:t>
             </w:r>
           </w:p>
         </w:tc>
@@ -3209,7 +3209,7 @@
           </w:tcPr>
           <w:p>
             <w:r>
-              <w:t>31.25 KB</w:t>
+              <w:t>29.21 KB</w:t>
             </w:r>
           </w:p>
         </w:tc>
@@ -3219,7 +3219,7 @@
           </w:tcPr>
           <w:p>
             <w:r>
-              <w:t>1.5x</w:t>
+              <w:t>0.9x</w:t>
             </w:r>
           </w:p>
         </w:tc>
@@ -3241,7 +3241,7 @@
           </w:tcPr>
           <w:p>
             <w:r>
-              <w:t>0.0000</w:t>
+              <w:t>0.1699</w:t>
             </w:r>
           </w:p>
         </w:tc>
@@ -3251,7 +3251,7 @@
           </w:tcPr>
           <w:p>
             <w:r>
-              <w:t>0.2440</w:t>
+              <w:t>0.1855</w:t>
             </w:r>
           </w:p>
         </w:tc>
@@ -3261,7 +3261,7 @@
           </w:tcPr>
           <w:p>
             <w:r>
-              <w:t>2.90 us/pkt</w:t>
+              <w:t>5.62 us/pkt</w:t>
             </w:r>
           </w:p>
         </w:tc>
@@ -3271,7 +3271,7 @@
           </w:tcPr>
           <w:p>
             <w:r>
-              <w:t>29.50 KB</w:t>
+              <w:t>24.66 KB</w:t>
             </w:r>
           </w:p>
         </w:tc>
@@ -3281,7 +3281,7 @@
           </w:tcPr>
           <w:p>
             <w:r>
-              <w:t>0.6x</w:t>
+              <w:t>0.3x</w:t>
             </w:r>
           </w:p>
         </w:tc>
@@ -3303,7 +3303,7 @@
           </w:tcPr>
           <w:p>
             <w:r>
-              <w:t>0.2553</w:t>
+              <w:t>0.1148</w:t>
             </w:r>
           </w:p>
         </w:tc>
@@ -3313,7 +3313,7 @@
           </w:tcPr>
           <w:p>
             <w:r>
-              <w:t>0.4799</w:t>
+              <w:t>0.4071</w:t>
             </w:r>
           </w:p>
         </w:tc>
@@ -3323,7 +3323,7 @@
           </w:tcPr>
           <w:p>
             <w:r>
-              <w:t>138.4 us/pkt</w:t>
+              <w:t>161.36 us/pkt</w:t>
             </w:r>
           </w:p>
         </w:tc>
@@ -3333,7 +3333,7 @@
           </w:tcPr>
           <w:p>
             <w:r>
-              <w:t>90.54 KB</w:t>
+              <w:t>89.87 KB</w:t>
             </w:r>
           </w:p>
         </w:tc>
@@ -3359,7 +3359,7 @@
       <w:r>
         <w:drawing>
           <wp:inline xmlns:a="http://schemas.openxmlformats.org/drawingml/2006/main" xmlns:pic="http://schemas.openxmlformats.org/drawingml/2006/picture">
-            <wp:extent cx="4572000" cy="2286000"/>
+            <wp:extent cx="4572000" cy="2743200"/>
             <wp:docPr id="4" name="Picture 4"/>
             <wp:cNvGraphicFramePr>
               <a:graphicFrameLocks noChangeAspect="1"/>
@@ -3368,7 +3368,7 @@
               <a:graphicData uri="http://schemas.openxmlformats.org/drawingml/2006/picture">
                 <pic:pic>
                   <pic:nvPicPr>
-                    <pic:cNvPr id="0" name="three_way_comparison.png"/>
+                    <pic:cNvPr id="0" name="model_optimization_comparison.png"/>
                     <pic:cNvPicPr/>
                   </pic:nvPicPr>
                   <pic:blipFill>
@@ -3380,7 +3380,7 @@
                   <pic:spPr>
                     <a:xfrm>
                       <a:off x="0" y="0"/>
-                      <a:ext cx="4572000" cy="2286000"/>
+                      <a:ext cx="4572000" cy="2743200"/>
                     </a:xfrm>
                     <a:prstGeom prst="rect"/>
                   </pic:spPr>
@@ -3541,7 +3541,7 @@
           </w:tcPr>
           <w:p>
             <w:r>
-              <w:t>0.2553</w:t>
+              <w:t>0.2573</w:t>
             </w:r>
           </w:p>
         </w:tc>
@@ -3551,7 +3551,7 @@
           </w:tcPr>
           <w:p>
             <w:r>
-              <w:t>0.5660</w:t>
+              <w:t>0.5597</w:t>
             </w:r>
           </w:p>
         </w:tc>
@@ -3561,7 +3561,7 @@
           </w:tcPr>
           <w:p>
             <w:r>
-              <w:t>0.0019 ms</w:t>
+              <w:t>0.0024 ms</w:t>
             </w:r>
           </w:p>
         </w:tc>
@@ -3603,7 +3603,7 @@
           </w:tcPr>
           <w:p>
             <w:r>
-              <w:t>0.0017</w:t>
+              <w:t>0.0018</w:t>
             </w:r>
           </w:p>
         </w:tc>
@@ -3613,7 +3613,7 @@
           </w:tcPr>
           <w:p>
             <w:r>
-              <w:t>0.0070</w:t>
+              <w:t>0.0013</w:t>
             </w:r>
           </w:p>
         </w:tc>
@@ -3623,7 +3623,7 @@
           </w:tcPr>
           <w:p>
             <w:r>
-              <w:t>0.0015 ms</w:t>
+              <w:t>0.0020 ms</w:t>
             </w:r>
           </w:p>
         </w:tc>
@@ -3633,7 +3633,7 @@
           </w:tcPr>
           <w:p>
             <w:r>
-              <w:t>-0.2536</w:t>
+              <w:t>-0.2556</w:t>
             </w:r>
           </w:p>
         </w:tc>
@@ -3643,7 +3643,7 @@
           </w:tcPr>
           <w:p>
             <w:r>
-              <w:t>-0.5590</w:t>
+              <w:t>-0.5584</w:t>
             </w:r>
           </w:p>
         </w:tc>
@@ -3685,7 +3685,7 @@
           </w:tcPr>
           <w:p>
             <w:r>
-              <w:t>0.0014 ms</w:t>
+              <w:t>0.0017 ms</w:t>
             </w:r>
           </w:p>
         </w:tc>
@@ -3695,7 +3695,7 @@
           </w:tcPr>
           <w:p>
             <w:r>
-              <w:t>-0.2553</w:t>
+              <w:t>-0.2573</w:t>
             </w:r>
           </w:p>
         </w:tc>
@@ -3705,7 +3705,7 @@
           </w:tcPr>
           <w:p>
             <w:r>
-              <w:t>-0.5660</w:t>
+              <w:t>-0.5597</w:t>
             </w:r>
           </w:p>
         </w:tc>
@@ -3747,7 +3747,7 @@
           </w:tcPr>
           <w:p>
             <w:r>
-              <w:t>0.0011 ms</w:t>
+              <w:t>0.0013 ms</w:t>
             </w:r>
           </w:p>
         </w:tc>
@@ -3757,7 +3757,7 @@
           </w:tcPr>
           <w:p>
             <w:r>
-              <w:t>-0.2553</w:t>
+              <w:t>-0.2573</w:t>
             </w:r>
           </w:p>
         </w:tc>
@@ -3767,7 +3767,7 @@
           </w:tcPr>
           <w:p>
             <w:r>
-              <w:t>-0.5660</w:t>
+              <w:t>-0.5597</w:t>
             </w:r>
           </w:p>
         </w:tc>
@@ -3799,7 +3799,7 @@
           </w:tcPr>
           <w:p>
             <w:r>
-              <w:t>0.2873</w:t>
+              <w:t>0.2869</w:t>
             </w:r>
           </w:p>
         </w:tc>
@@ -3809,7 +3809,7 @@
           </w:tcPr>
           <w:p>
             <w:r>
-              <w:t>0.0014 ms</w:t>
+              <w:t>0.0012 ms</w:t>
             </w:r>
           </w:p>
         </w:tc>
@@ -3819,7 +3819,7 @@
           </w:tcPr>
           <w:p>
             <w:r>
-              <w:t>+0.6433</w:t>
+              <w:t>+0.6413</w:t>
             </w:r>
           </w:p>
         </w:tc>
@@ -3829,7 +3829,7 @@
           </w:tcPr>
           <w:p>
             <w:r>
-              <w:t>-0.2787</w:t>
+              <w:t>-0.2728</w:t>
             </w:r>
           </w:p>
         </w:tc>
@@ -3837,7 +3837,7 @@
     </w:tbl>
     <w:p>
       <w:r>
-        <w:t>Ablation 4 (Data Leakage Verification): Shuffling network logs instead of splitting them chronologically inflates the F1-score artificially by +0.6433 (rising from 0.2553 to 0.8986). This empirical proof demonstrates that randomized data partitioning introduces severe data leakage and invalidates cybersecurity evaluations.</w:t>
+        <w:t>Ablation 4 (Data Leakage Verification): Shuffling network logs instead of splitting them chronologically inflates the F1-score artificially by +0.6413 (rising from 0.2573 to 0.8986). This empirical proof demonstrates that randomized data partitioning introduces severe data leakage and invalidates cybersecurity evaluations.</w:t>
       </w:r>
     </w:p>
     <w:p>

</xml_diff>